<commit_message>
Redaccion del primer hallazgo
</commit_message>
<xml_diff>
--- a/SILAIS - Auditoria/AVANCES_PROYECTO_FINAL/HALLAZGOS.docx
+++ b/SILAIS - Auditoria/AVANCES_PROYECTO_FINAL/HALLAZGOS.docx
@@ -2,25 +2,49 @@
 <file path=word/document.xml><?xml version="1.0" encoding="utf-8"?>
 <w:document xmlns:wpc="http://schemas.microsoft.com/office/word/2010/wordprocessingCanvas" xmlns:cx="http://schemas.microsoft.com/office/drawing/2014/chartex" xmlns:cx1="http://schemas.microsoft.com/office/drawing/2015/9/8/chartex" xmlns:cx2="http://schemas.microsoft.com/office/drawing/2015/10/21/chartex" xmlns:cx3="http://schemas.microsoft.com/office/drawing/2016/5/9/chartex" xmlns:cx4="http://schemas.microsoft.com/office/drawing/2016/5/10/chartex" xmlns:cx5="http://schemas.microsoft.com/office/drawing/2016/5/11/chartex" xmlns:cx6="http://schemas.microsoft.com/office/drawing/2016/5/12/chartex" xmlns:cx7="http://schemas.microsoft.com/office/drawing/2016/5/13/chartex" xmlns:cx8="http://schemas.microsoft.com/office/drawing/2016/5/14/chartex" xmlns:mc="http://schemas.openxmlformats.org/markup-compatibility/2006" xmlns:aink="http://schemas.microsoft.com/office/drawing/2016/ink" xmlns:am3d="http://schemas.microsoft.com/office/drawing/2017/model3d" xmlns:o="urn:schemas-microsoft-com:office:office" xmlns:r="http://schemas.openxmlformats.org/officeDocument/2006/relationships" xmlns:m="http://schemas.openxmlformats.org/officeDocument/2006/math" xmlns:v="urn:schemas-microsoft-com:vml" xmlns:wp14="http://schemas.microsoft.com/office/word/2010/wordprocessingDrawing" xmlns:wp="http://schemas.openxmlformats.org/drawingml/2006/wordprocessingDrawing" xmlns:w10="urn:schemas-microsoft-com:office:word" xmlns:w="http://schemas.openxmlformats.org/wordprocessingml/2006/main" xmlns:w14="http://schemas.microsoft.com/office/word/2010/wordml" xmlns:w15="http://schemas.microsoft.com/office/word/2012/wordml" xmlns:w16cex="http://schemas.microsoft.com/office/word/2018/wordml/cex" xmlns:w16cid="http://schemas.microsoft.com/office/word/2016/wordml/cid" xmlns:w16="http://schemas.microsoft.com/office/word/2018/wordml" xmlns:w16sdtdh="http://schemas.microsoft.com/office/word/2020/wordml/sdtdatahash" xmlns:w16se="http://schemas.microsoft.com/office/word/2015/wordml/symex" xmlns:wpg="http://schemas.microsoft.com/office/word/2010/wordprocessingGroup" xmlns:wpi="http://schemas.microsoft.com/office/word/2010/wordprocessingInk" xmlns:wne="http://schemas.microsoft.com/office/word/2006/wordml" xmlns:wps="http://schemas.microsoft.com/office/word/2010/wordprocessingShape" mc:Ignorable="w14 w15 w16se w16cid w16 w16cex w16sdtdh wp14">
   <w:body>
+    <w:p>
+      <w:pPr>
+        <w:pStyle w:val="Prrafodelista"/>
+        <w:numPr>
+          <w:ilvl w:val="0"/>
+          <w:numId w:val="4"/>
+        </w:numPr>
+        <w:rPr>
+          <w:b/>
+          <w:bCs/>
+        </w:rPr>
+      </w:pPr>
+      <w:r>
+        <w:rPr>
+          <w:b/>
+          <w:bCs/>
+        </w:rPr>
+        <w:t>HALLAZGOS DE INFRAESTRUCTURA DE HARDWARE DE RED</w:t>
+      </w:r>
+    </w:p>
     <w:tbl>
       <w:tblPr>
         <w:tblStyle w:val="Tablaconcuadrcula"/>
-        <w:tblW w:w="9350" w:type="dxa"/>
+        <w:tblpPr w:leftFromText="141" w:rightFromText="141" w:vertAnchor="page" w:horzAnchor="margin" w:tblpXSpec="center" w:tblpY="2065"/>
+        <w:tblW w:w="11255" w:type="dxa"/>
         <w:tblLook w:val="04A0" w:firstRow="1" w:lastRow="0" w:firstColumn="1" w:lastColumn="0" w:noHBand="0" w:noVBand="1"/>
       </w:tblPr>
       <w:tblGrid>
-        <w:gridCol w:w="1872"/>
-        <w:gridCol w:w="2868"/>
-        <w:gridCol w:w="1610"/>
-        <w:gridCol w:w="1328"/>
-        <w:gridCol w:w="527"/>
-        <w:gridCol w:w="537"/>
-        <w:gridCol w:w="608"/>
+        <w:gridCol w:w="3343"/>
+        <w:gridCol w:w="2678"/>
+        <w:gridCol w:w="2391"/>
+        <w:gridCol w:w="319"/>
+        <w:gridCol w:w="751"/>
+        <w:gridCol w:w="1010"/>
+        <w:gridCol w:w="763"/>
       </w:tblGrid>
       <w:tr>
-        <w:tc>
-          <w:tcPr>
-            <w:tcW w:w="7678" w:type="dxa"/>
+        <w:trPr>
+          <w:trHeight w:val="350"/>
+        </w:trPr>
+        <w:tc>
+          <w:tcPr>
+            <w:tcW w:w="8731" w:type="dxa"/>
             <w:gridSpan w:val="4"/>
           </w:tcPr>
           <w:p>
@@ -31,20 +55,27 @@
         </w:tc>
         <w:tc>
           <w:tcPr>
-            <w:tcW w:w="1672" w:type="dxa"/>
+            <w:tcW w:w="2524" w:type="dxa"/>
             <w:gridSpan w:val="3"/>
           </w:tcPr>
           <w:p>
             <w:r>
-              <w:t>REF</w:t>
+              <w:rPr>
+                <w:b/>
+                <w:bCs/>
+              </w:rPr>
+              <w:t>REF: H-RED-INFRA-01</w:t>
             </w:r>
           </w:p>
         </w:tc>
       </w:tr>
       <w:tr>
-        <w:tc>
-          <w:tcPr>
-            <w:tcW w:w="7678" w:type="dxa"/>
+        <w:trPr>
+          <w:trHeight w:val="250"/>
+        </w:trPr>
+        <w:tc>
+          <w:tcPr>
+            <w:tcW w:w="8731" w:type="dxa"/>
             <w:gridSpan w:val="4"/>
           </w:tcPr>
           <w:p>
@@ -55,7 +86,7 @@
         </w:tc>
         <w:tc>
           <w:tcPr>
-            <w:tcW w:w="1672" w:type="dxa"/>
+            <w:tcW w:w="2524" w:type="dxa"/>
             <w:gridSpan w:val="3"/>
           </w:tcPr>
           <w:p>
@@ -66,9 +97,12 @@
         </w:tc>
       </w:tr>
       <w:tr>
-        <w:tc>
-          <w:tcPr>
-            <w:tcW w:w="1872" w:type="dxa"/>
+        <w:trPr>
+          <w:trHeight w:val="250"/>
+        </w:trPr>
+        <w:tc>
+          <w:tcPr>
+            <w:tcW w:w="3343" w:type="dxa"/>
             <w:vMerge w:val="restart"/>
             <w:shd w:val="clear" w:color="auto" w:fill="D0CECE" w:themeFill="background2" w:themeFillShade="E6"/>
           </w:tcPr>
@@ -80,15 +114,22 @@
         </w:tc>
         <w:tc>
           <w:tcPr>
-            <w:tcW w:w="5806" w:type="dxa"/>
+            <w:tcW w:w="5388" w:type="dxa"/>
             <w:gridSpan w:val="3"/>
             <w:vMerge w:val="restart"/>
-          </w:tcPr>
-          <w:p/>
-        </w:tc>
-        <w:tc>
-          <w:tcPr>
-            <w:tcW w:w="1672" w:type="dxa"/>
+            <w:tcBorders>
+              <w:bottom w:val="nil"/>
+            </w:tcBorders>
+          </w:tcPr>
+          <w:p>
+            <w:r>
+              <w:t>Seguridad física de la infraestructura de red</w:t>
+            </w:r>
+          </w:p>
+        </w:tc>
+        <w:tc>
+          <w:tcPr>
+            <w:tcW w:w="2524" w:type="dxa"/>
             <w:gridSpan w:val="3"/>
           </w:tcPr>
           <w:p>
@@ -99,9 +140,12 @@
         </w:tc>
       </w:tr>
       <w:tr>
-        <w:tc>
-          <w:tcPr>
-            <w:tcW w:w="1872" w:type="dxa"/>
+        <w:trPr>
+          <w:trHeight w:val="260"/>
+        </w:trPr>
+        <w:tc>
+          <w:tcPr>
+            <w:tcW w:w="3343" w:type="dxa"/>
             <w:vMerge/>
             <w:shd w:val="clear" w:color="auto" w:fill="D0CECE" w:themeFill="background2" w:themeFillShade="E6"/>
           </w:tcPr>
@@ -109,15 +153,18 @@
         </w:tc>
         <w:tc>
           <w:tcPr>
-            <w:tcW w:w="5806" w:type="dxa"/>
+            <w:tcW w:w="5388" w:type="dxa"/>
             <w:gridSpan w:val="3"/>
             <w:vMerge/>
+            <w:tcBorders>
+              <w:bottom w:val="nil"/>
+            </w:tcBorders>
           </w:tcPr>
           <w:p/>
         </w:tc>
         <w:tc>
           <w:tcPr>
-            <w:tcW w:w="527" w:type="dxa"/>
+            <w:tcW w:w="751" w:type="dxa"/>
           </w:tcPr>
           <w:p>
             <w:r>
@@ -127,7 +174,7 @@
         </w:tc>
         <w:tc>
           <w:tcPr>
-            <w:tcW w:w="537" w:type="dxa"/>
+            <w:tcW w:w="1010" w:type="dxa"/>
           </w:tcPr>
           <w:p>
             <w:r>
@@ -137,7 +184,7 @@
         </w:tc>
         <w:tc>
           <w:tcPr>
-            <w:tcW w:w="608" w:type="dxa"/>
+            <w:tcW w:w="763" w:type="dxa"/>
           </w:tcPr>
           <w:p>
             <w:r>
@@ -147,9 +194,12 @@
         </w:tc>
       </w:tr>
       <w:tr>
-        <w:tc>
-          <w:tcPr>
-            <w:tcW w:w="1872" w:type="dxa"/>
+        <w:trPr>
+          <w:trHeight w:val="260"/>
+        </w:trPr>
+        <w:tc>
+          <w:tcPr>
+            <w:tcW w:w="3343" w:type="dxa"/>
             <w:shd w:val="clear" w:color="auto" w:fill="D0CECE" w:themeFill="background2" w:themeFillShade="E6"/>
           </w:tcPr>
           <w:p>
@@ -160,16 +210,19 @@
         </w:tc>
         <w:tc>
           <w:tcPr>
-            <w:tcW w:w="7478" w:type="dxa"/>
+            <w:tcW w:w="7912" w:type="dxa"/>
             <w:gridSpan w:val="6"/>
           </w:tcPr>
           <w:p/>
         </w:tc>
       </w:tr>
       <w:tr>
-        <w:tc>
-          <w:tcPr>
-            <w:tcW w:w="1872" w:type="dxa"/>
+        <w:trPr>
+          <w:trHeight w:val="250"/>
+        </w:trPr>
+        <w:tc>
+          <w:tcPr>
+            <w:tcW w:w="3343" w:type="dxa"/>
             <w:shd w:val="clear" w:color="auto" w:fill="D0CECE" w:themeFill="background2" w:themeFillShade="E6"/>
           </w:tcPr>
           <w:p>
@@ -180,16 +233,23 @@
         </w:tc>
         <w:tc>
           <w:tcPr>
-            <w:tcW w:w="7478" w:type="dxa"/>
+            <w:tcW w:w="7912" w:type="dxa"/>
             <w:gridSpan w:val="6"/>
           </w:tcPr>
-          <w:p/>
+          <w:p>
+            <w:r>
+              <w:t>ISO 27001 A.11.1, ANSI/TIA-569-C, COBIT DSS05</w:t>
+            </w:r>
+          </w:p>
         </w:tc>
       </w:tr>
       <w:tr>
-        <w:tc>
-          <w:tcPr>
-            <w:tcW w:w="1872" w:type="dxa"/>
+        <w:trPr>
+          <w:trHeight w:val="545"/>
+        </w:trPr>
+        <w:tc>
+          <w:tcPr>
+            <w:tcW w:w="3343" w:type="dxa"/>
             <w:shd w:val="clear" w:color="auto" w:fill="D0CECE" w:themeFill="background2" w:themeFillShade="E6"/>
           </w:tcPr>
           <w:p>
@@ -200,13 +260,17 @@
         </w:tc>
         <w:tc>
           <w:tcPr>
-            <w:tcW w:w="2868" w:type="dxa"/>
-          </w:tcPr>
-          <w:p/>
-        </w:tc>
-        <w:tc>
-          <w:tcPr>
-            <w:tcW w:w="1610" w:type="dxa"/>
+            <w:tcW w:w="2678" w:type="dxa"/>
+          </w:tcPr>
+          <w:p>
+            <w:r>
+              <w:t>DSS (Entregar, Dar Servicio y Soporte)</w:t>
+            </w:r>
+          </w:p>
+        </w:tc>
+        <w:tc>
+          <w:tcPr>
+            <w:tcW w:w="2391" w:type="dxa"/>
             <w:shd w:val="clear" w:color="auto" w:fill="D0CECE" w:themeFill="background2" w:themeFillShade="E6"/>
           </w:tcPr>
           <w:p>
@@ -217,16 +281,23 @@
         </w:tc>
         <w:tc>
           <w:tcPr>
-            <w:tcW w:w="3000" w:type="dxa"/>
+            <w:tcW w:w="2843" w:type="dxa"/>
             <w:gridSpan w:val="4"/>
           </w:tcPr>
-          <w:p/>
+          <w:p>
+            <w:r>
+              <w:t>DSS05 – Gestión de Servicios de Seguridad</w:t>
+            </w:r>
+          </w:p>
         </w:tc>
       </w:tr>
       <w:tr>
-        <w:tc>
-          <w:tcPr>
-            <w:tcW w:w="9350" w:type="dxa"/>
+        <w:trPr>
+          <w:trHeight w:val="250"/>
+        </w:trPr>
+        <w:tc>
+          <w:tcPr>
+            <w:tcW w:w="11255" w:type="dxa"/>
             <w:gridSpan w:val="7"/>
             <w:shd w:val="clear" w:color="auto" w:fill="D0CECE" w:themeFill="background2" w:themeFillShade="E6"/>
           </w:tcPr>
@@ -249,18 +320,28 @@
         </w:tc>
       </w:tr>
       <w:tr>
-        <w:tc>
-          <w:tcPr>
-            <w:tcW w:w="9350" w:type="dxa"/>
+        <w:trPr>
+          <w:trHeight w:val="1531"/>
+        </w:trPr>
+        <w:tc>
+          <w:tcPr>
+            <w:tcW w:w="11255" w:type="dxa"/>
             <w:gridSpan w:val="7"/>
           </w:tcPr>
-          <w:p/>
+          <w:p>
+            <w:r>
+              <w:t>No existe un rack o gabinete de telecomunicaciones cerrado con llave para alojar los switches. Los dos switches principales ubicados en el área de Dirección se encuentran sobre un soporte metálico, y el switch secundario ubicado en el área de Varios 1 se encuentra sobre la gaveta metálica de un escritorio. Esta condición deja los puertos de red y los equipos expuestos a manipulación accidental o malintencionada por parte de personal no autorizado, visitantes o personal de limpieza.</w:t>
+            </w:r>
+          </w:p>
         </w:tc>
       </w:tr>
       <w:tr>
-        <w:tc>
-          <w:tcPr>
-            <w:tcW w:w="9350" w:type="dxa"/>
+        <w:trPr>
+          <w:trHeight w:val="250"/>
+        </w:trPr>
+        <w:tc>
+          <w:tcPr>
+            <w:tcW w:w="11255" w:type="dxa"/>
             <w:gridSpan w:val="7"/>
             <w:shd w:val="clear" w:color="auto" w:fill="D0CECE" w:themeFill="background2" w:themeFillShade="E6"/>
           </w:tcPr>
@@ -272,18 +353,57 @@
         </w:tc>
       </w:tr>
       <w:tr>
-        <w:tc>
-          <w:tcPr>
-            <w:tcW w:w="9350" w:type="dxa"/>
+        <w:trPr>
+          <w:trHeight w:val="1130"/>
+        </w:trPr>
+        <w:tc>
+          <w:tcPr>
+            <w:tcW w:w="11255" w:type="dxa"/>
             <w:gridSpan w:val="7"/>
           </w:tcPr>
+          <w:p>
+            <w:pPr>
+              <w:numPr>
+                <w:ilvl w:val="0"/>
+                <w:numId w:val="1"/>
+              </w:numPr>
+            </w:pPr>
+            <w:r>
+              <w:t>Inexistencia de un responsable formal de la administración de la red que identifique y gestione las necesidades de protección física de los equipos.</w:t>
+            </w:r>
+          </w:p>
+          <w:p>
+            <w:pPr>
+              <w:numPr>
+                <w:ilvl w:val="0"/>
+                <w:numId w:val="1"/>
+              </w:numPr>
+            </w:pPr>
+            <w:r>
+              <w:t>Ausencia de políticas institucionales de seguridad física aplicadas a los activos de telecomunicaciones.</w:t>
+            </w:r>
+          </w:p>
+          <w:p>
+            <w:pPr>
+              <w:numPr>
+                <w:ilvl w:val="0"/>
+                <w:numId w:val="1"/>
+              </w:numPr>
+            </w:pPr>
+            <w:r>
+              <w:t>Falta de presupuesto priorizado para la instalación de racks o gabinetes de protección.</w:t>
+            </w:r>
+          </w:p>
           <w:p/>
         </w:tc>
       </w:tr>
       <w:tr>
-        <w:tc>
-          <w:tcPr>
-            <w:tcW w:w="9350" w:type="dxa"/>
+        <w:trPr>
+          <w:trHeight w:val="250"/>
+        </w:trPr>
+        <w:tc>
+          <w:tcPr>
+            <w:tcW w:w="11255" w:type="dxa"/>
             <w:gridSpan w:val="7"/>
             <w:shd w:val="clear" w:color="auto" w:fill="D0CECE" w:themeFill="background2" w:themeFillShade="E6"/>
           </w:tcPr>
@@ -295,18 +415,50 @@
         </w:tc>
       </w:tr>
       <w:tr>
-        <w:tc>
-          <w:tcPr>
-            <w:tcW w:w="9350" w:type="dxa"/>
+        <w:trPr>
+          <w:trHeight w:val="1247"/>
+        </w:trPr>
+        <w:tc>
+          <w:tcPr>
+            <w:tcW w:w="11255" w:type="dxa"/>
             <w:gridSpan w:val="7"/>
           </w:tcPr>
-          <w:p/>
+          <w:p>
+            <w:pPr>
+              <w:numPr>
+                <w:ilvl w:val="0"/>
+                <w:numId w:val="2"/>
+              </w:numPr>
+            </w:pPr>
+            <w:r>
+              <w:t>Fotografías del área de Dirección y Varios 1 que muestran los switches sobre soportes metálicos y gavetas de escritorio, sin protección.</w:t>
+            </w:r>
+          </w:p>
+          <w:p>
+            <w:pPr>
+              <w:numPr>
+                <w:ilvl w:val="0"/>
+                <w:numId w:val="2"/>
+              </w:numPr>
+            </w:pPr>
+            <w:proofErr w:type="spellStart"/>
+            <w:r>
+              <w:t>Checklist</w:t>
+            </w:r>
+            <w:proofErr w:type="spellEnd"/>
+            <w:r>
+              <w:t xml:space="preserve"> de inspección física Módulo I, criterio F-01: ¿Los equipos de red centrales están alojados de forma segura dentro de un Gabinete o Rack cerrado con llave? Respuesta: NO.</w:t>
+            </w:r>
+          </w:p>
         </w:tc>
       </w:tr>
       <w:tr>
-        <w:tc>
-          <w:tcPr>
-            <w:tcW w:w="9350" w:type="dxa"/>
+        <w:trPr>
+          <w:trHeight w:val="260"/>
+        </w:trPr>
+        <w:tc>
+          <w:tcPr>
+            <w:tcW w:w="11255" w:type="dxa"/>
             <w:gridSpan w:val="7"/>
             <w:shd w:val="clear" w:color="auto" w:fill="D0CECE" w:themeFill="background2" w:themeFillShade="E6"/>
           </w:tcPr>
@@ -318,18 +470,56 @@
         </w:tc>
       </w:tr>
       <w:tr>
-        <w:tc>
-          <w:tcPr>
-            <w:tcW w:w="9350" w:type="dxa"/>
+        <w:trPr>
+          <w:trHeight w:val="760"/>
+        </w:trPr>
+        <w:tc>
+          <w:tcPr>
+            <w:tcW w:w="11255" w:type="dxa"/>
             <w:gridSpan w:val="7"/>
           </w:tcPr>
-          <w:p/>
+          <w:p>
+            <w:pPr>
+              <w:numPr>
+                <w:ilvl w:val="0"/>
+                <w:numId w:val="3"/>
+              </w:numPr>
+            </w:pPr>
+            <w:r>
+              <w:t>Riesgo de conexión no autorizada de dispositivos a la red LAN del SILAIS.</w:t>
+            </w:r>
+          </w:p>
+          <w:p>
+            <w:pPr>
+              <w:numPr>
+                <w:ilvl w:val="0"/>
+                <w:numId w:val="3"/>
+              </w:numPr>
+            </w:pPr>
+            <w:r>
+              <w:t>Exposición a daños físicos por golpes accidentales o derrame de líquidos.</w:t>
+            </w:r>
+          </w:p>
+          <w:p>
+            <w:pPr>
+              <w:numPr>
+                <w:ilvl w:val="0"/>
+                <w:numId w:val="3"/>
+              </w:numPr>
+            </w:pPr>
+            <w:r>
+              <w:t>Mayor acumulación de polvo y suciedad en los equipos, acelerando su degradación.</w:t>
+            </w:r>
+          </w:p>
         </w:tc>
       </w:tr>
       <w:tr>
-        <w:tc>
-          <w:tcPr>
-            <w:tcW w:w="9350" w:type="dxa"/>
+        <w:trPr>
+          <w:trHeight w:val="250"/>
+        </w:trPr>
+        <w:tc>
+          <w:tcPr>
+            <w:tcW w:w="11255" w:type="dxa"/>
             <w:gridSpan w:val="7"/>
             <w:shd w:val="clear" w:color="auto" w:fill="D0CECE" w:themeFill="background2" w:themeFillShade="E6"/>
           </w:tcPr>
@@ -341,18 +531,560 @@
         </w:tc>
       </w:tr>
       <w:tr>
-        <w:tc>
-          <w:tcPr>
-            <w:tcW w:w="9350" w:type="dxa"/>
+        <w:trPr>
+          <w:trHeight w:val="1177"/>
+        </w:trPr>
+        <w:tc>
+          <w:tcPr>
+            <w:tcW w:w="11255" w:type="dxa"/>
             <w:gridSpan w:val="7"/>
           </w:tcPr>
+          <w:tbl>
+            <w:tblPr>
+              <w:tblW w:w="10994" w:type="dxa"/>
+              <w:tblInd w:w="14" w:type="dxa"/>
+              <w:tblCellMar>
+                <w:left w:w="70" w:type="dxa"/>
+                <w:right w:w="70" w:type="dxa"/>
+              </w:tblCellMar>
+              <w:tblLook w:val="04A0" w:firstRow="1" w:lastRow="0" w:firstColumn="1" w:lastColumn="0" w:noHBand="0" w:noVBand="1"/>
+            </w:tblPr>
+            <w:tblGrid>
+              <w:gridCol w:w="6718"/>
+              <w:gridCol w:w="1396"/>
+              <w:gridCol w:w="1484"/>
+              <w:gridCol w:w="1396"/>
+            </w:tblGrid>
+            <w:tr>
+              <w:trPr>
+                <w:trHeight w:val="250"/>
+              </w:trPr>
+              <w:tc>
+                <w:tcPr>
+                  <w:tcW w:w="6718" w:type="dxa"/>
+                  <w:tcBorders>
+                    <w:top w:val="nil"/>
+                    <w:left w:val="nil"/>
+                    <w:bottom w:val="nil"/>
+                    <w:right w:val="nil"/>
+                  </w:tcBorders>
+                  <w:shd w:val="clear" w:color="auto" w:fill="auto"/>
+                  <w:noWrap/>
+                  <w:vAlign w:val="bottom"/>
+                  <w:hideMark/>
+                </w:tcPr>
+                <w:p>
+                  <w:pPr>
+                    <w:framePr w:hSpace="141" w:wrap="around" w:vAnchor="page" w:hAnchor="margin" w:xAlign="center" w:y="2065"/>
+                    <w:spacing w:after="0" w:line="240" w:lineRule="auto"/>
+                    <w:rPr>
+                      <w:rFonts w:ascii="Calibri" w:eastAsia="Times New Roman" w:hAnsi="Calibri" w:cs="Calibri"/>
+                      <w:color w:val="000000"/>
+                      <w:kern w:val="0"/>
+                      <w:sz w:val="22"/>
+                      <w:szCs w:val="22"/>
+                      <w:lang w:eastAsia="es-US"/>
+                      <w14:ligatures w14:val="none"/>
+                    </w:rPr>
+                  </w:pPr>
+                  <w:r>
+                    <w:rPr>
+                      <w:rFonts w:ascii="Calibri" w:eastAsia="Times New Roman" w:hAnsi="Calibri" w:cs="Calibri"/>
+                      <w:color w:val="000000"/>
+                      <w:kern w:val="0"/>
+                      <w:sz w:val="22"/>
+                      <w:szCs w:val="22"/>
+                      <w:lang w:eastAsia="es-US"/>
+                      <w14:ligatures w14:val="none"/>
+                    </w:rPr>
+                    <w:t>Riesgo Asociado</w:t>
+                  </w:r>
+                </w:p>
+              </w:tc>
+              <w:tc>
+                <w:tcPr>
+                  <w:tcW w:w="1396" w:type="dxa"/>
+                  <w:tcBorders>
+                    <w:top w:val="nil"/>
+                    <w:left w:val="nil"/>
+                    <w:bottom w:val="nil"/>
+                    <w:right w:val="nil"/>
+                  </w:tcBorders>
+                  <w:shd w:val="clear" w:color="auto" w:fill="auto"/>
+                  <w:noWrap/>
+                  <w:vAlign w:val="bottom"/>
+                  <w:hideMark/>
+                </w:tcPr>
+                <w:p>
+                  <w:pPr>
+                    <w:framePr w:hSpace="141" w:wrap="around" w:vAnchor="page" w:hAnchor="margin" w:xAlign="center" w:y="2065"/>
+                    <w:spacing w:after="0" w:line="240" w:lineRule="auto"/>
+                    <w:rPr>
+                      <w:rFonts w:ascii="Calibri" w:eastAsia="Times New Roman" w:hAnsi="Calibri" w:cs="Calibri"/>
+                      <w:color w:val="000000"/>
+                      <w:kern w:val="0"/>
+                      <w:sz w:val="22"/>
+                      <w:szCs w:val="22"/>
+                      <w:lang w:eastAsia="es-US"/>
+                      <w14:ligatures w14:val="none"/>
+                    </w:rPr>
+                  </w:pPr>
+                  <w:r>
+                    <w:rPr>
+                      <w:rFonts w:ascii="Calibri" w:eastAsia="Times New Roman" w:hAnsi="Calibri" w:cs="Calibri"/>
+                      <w:color w:val="000000"/>
+                      <w:kern w:val="0"/>
+                      <w:sz w:val="22"/>
+                      <w:szCs w:val="22"/>
+                      <w:lang w:eastAsia="es-US"/>
+                      <w14:ligatures w14:val="none"/>
+                    </w:rPr>
+                    <w:t>Impacto</w:t>
+                  </w:r>
+                </w:p>
+              </w:tc>
+              <w:tc>
+                <w:tcPr>
+                  <w:tcW w:w="1484" w:type="dxa"/>
+                  <w:tcBorders>
+                    <w:top w:val="nil"/>
+                    <w:left w:val="nil"/>
+                    <w:bottom w:val="nil"/>
+                    <w:right w:val="nil"/>
+                  </w:tcBorders>
+                  <w:shd w:val="clear" w:color="auto" w:fill="auto"/>
+                  <w:noWrap/>
+                  <w:vAlign w:val="bottom"/>
+                  <w:hideMark/>
+                </w:tcPr>
+                <w:p>
+                  <w:pPr>
+                    <w:framePr w:hSpace="141" w:wrap="around" w:vAnchor="page" w:hAnchor="margin" w:xAlign="center" w:y="2065"/>
+                    <w:spacing w:after="0" w:line="240" w:lineRule="auto"/>
+                    <w:rPr>
+                      <w:rFonts w:ascii="Calibri" w:eastAsia="Times New Roman" w:hAnsi="Calibri" w:cs="Calibri"/>
+                      <w:color w:val="000000"/>
+                      <w:kern w:val="0"/>
+                      <w:sz w:val="22"/>
+                      <w:szCs w:val="22"/>
+                      <w:lang w:eastAsia="es-US"/>
+                      <w14:ligatures w14:val="none"/>
+                    </w:rPr>
+                  </w:pPr>
+                  <w:r>
+                    <w:rPr>
+                      <w:rFonts w:ascii="Calibri" w:eastAsia="Times New Roman" w:hAnsi="Calibri" w:cs="Calibri"/>
+                      <w:color w:val="000000"/>
+                      <w:kern w:val="0"/>
+                      <w:sz w:val="22"/>
+                      <w:szCs w:val="22"/>
+                      <w:lang w:eastAsia="es-US"/>
+                      <w14:ligatures w14:val="none"/>
+                    </w:rPr>
+                    <w:t>Probabilidad</w:t>
+                  </w:r>
+                </w:p>
+              </w:tc>
+              <w:tc>
+                <w:tcPr>
+                  <w:tcW w:w="1396" w:type="dxa"/>
+                  <w:tcBorders>
+                    <w:top w:val="nil"/>
+                    <w:left w:val="nil"/>
+                    <w:bottom w:val="nil"/>
+                    <w:right w:val="nil"/>
+                  </w:tcBorders>
+                  <w:shd w:val="clear" w:color="auto" w:fill="auto"/>
+                  <w:noWrap/>
+                  <w:vAlign w:val="bottom"/>
+                  <w:hideMark/>
+                </w:tcPr>
+                <w:p>
+                  <w:pPr>
+                    <w:framePr w:hSpace="141" w:wrap="around" w:vAnchor="page" w:hAnchor="margin" w:xAlign="center" w:y="2065"/>
+                    <w:spacing w:after="0" w:line="240" w:lineRule="auto"/>
+                    <w:rPr>
+                      <w:rFonts w:ascii="Calibri" w:eastAsia="Times New Roman" w:hAnsi="Calibri" w:cs="Calibri"/>
+                      <w:color w:val="000000"/>
+                      <w:kern w:val="0"/>
+                      <w:sz w:val="22"/>
+                      <w:szCs w:val="22"/>
+                      <w:lang w:eastAsia="es-US"/>
+                      <w14:ligatures w14:val="none"/>
+                    </w:rPr>
+                  </w:pPr>
+                  <w:r>
+                    <w:rPr>
+                      <w:rFonts w:ascii="Calibri" w:eastAsia="Times New Roman" w:hAnsi="Calibri" w:cs="Calibri"/>
+                      <w:color w:val="000000"/>
+                      <w:kern w:val="0"/>
+                      <w:sz w:val="22"/>
+                      <w:szCs w:val="22"/>
+                      <w:lang w:eastAsia="es-US"/>
+                      <w14:ligatures w14:val="none"/>
+                    </w:rPr>
+                    <w:t>Nivel de Riesgo</w:t>
+                  </w:r>
+                </w:p>
+              </w:tc>
+            </w:tr>
+            <w:tr>
+              <w:trPr>
+                <w:trHeight w:val="250"/>
+              </w:trPr>
+              <w:tc>
+                <w:tcPr>
+                  <w:tcW w:w="6718" w:type="dxa"/>
+                  <w:tcBorders>
+                    <w:top w:val="nil"/>
+                    <w:left w:val="nil"/>
+                    <w:bottom w:val="nil"/>
+                    <w:right w:val="nil"/>
+                  </w:tcBorders>
+                  <w:shd w:val="clear" w:color="auto" w:fill="auto"/>
+                  <w:noWrap/>
+                  <w:vAlign w:val="bottom"/>
+                  <w:hideMark/>
+                </w:tcPr>
+                <w:p>
+                  <w:pPr>
+                    <w:framePr w:hSpace="141" w:wrap="around" w:vAnchor="page" w:hAnchor="margin" w:xAlign="center" w:y="2065"/>
+                    <w:spacing w:after="0" w:line="240" w:lineRule="auto"/>
+                    <w:rPr>
+                      <w:rFonts w:ascii="Calibri" w:eastAsia="Times New Roman" w:hAnsi="Calibri" w:cs="Calibri"/>
+                      <w:color w:val="000000"/>
+                      <w:kern w:val="0"/>
+                      <w:sz w:val="22"/>
+                      <w:szCs w:val="22"/>
+                      <w:lang w:eastAsia="es-US"/>
+                      <w14:ligatures w14:val="none"/>
+                    </w:rPr>
+                  </w:pPr>
+                  <w:r>
+                    <w:rPr>
+                      <w:rFonts w:ascii="Calibri" w:eastAsia="Times New Roman" w:hAnsi="Calibri" w:cs="Calibri"/>
+                      <w:color w:val="000000"/>
+                      <w:kern w:val="0"/>
+                      <w:sz w:val="22"/>
+                      <w:szCs w:val="22"/>
+                      <w:lang w:eastAsia="es-US"/>
+                      <w14:ligatures w14:val="none"/>
+                    </w:rPr>
+                    <w:t>R-RED-011: Conexión de dispositivos no autorizados a la red</w:t>
+                  </w:r>
+                </w:p>
+              </w:tc>
+              <w:tc>
+                <w:tcPr>
+                  <w:tcW w:w="1396" w:type="dxa"/>
+                  <w:tcBorders>
+                    <w:top w:val="nil"/>
+                    <w:left w:val="nil"/>
+                    <w:bottom w:val="nil"/>
+                    <w:right w:val="nil"/>
+                  </w:tcBorders>
+                  <w:shd w:val="clear" w:color="auto" w:fill="auto"/>
+                  <w:noWrap/>
+                  <w:vAlign w:val="bottom"/>
+                  <w:hideMark/>
+                </w:tcPr>
+                <w:p>
+                  <w:pPr>
+                    <w:framePr w:hSpace="141" w:wrap="around" w:vAnchor="page" w:hAnchor="margin" w:xAlign="center" w:y="2065"/>
+                    <w:spacing w:after="0" w:line="240" w:lineRule="auto"/>
+                    <w:rPr>
+                      <w:rFonts w:ascii="Calibri" w:eastAsia="Times New Roman" w:hAnsi="Calibri" w:cs="Calibri"/>
+                      <w:color w:val="000000"/>
+                      <w:kern w:val="0"/>
+                      <w:sz w:val="22"/>
+                      <w:szCs w:val="22"/>
+                      <w:lang w:eastAsia="es-US"/>
+                      <w14:ligatures w14:val="none"/>
+                    </w:rPr>
+                  </w:pPr>
+                  <w:r>
+                    <w:rPr>
+                      <w:rFonts w:ascii="Calibri" w:eastAsia="Times New Roman" w:hAnsi="Calibri" w:cs="Calibri"/>
+                      <w:color w:val="000000"/>
+                      <w:kern w:val="0"/>
+                      <w:sz w:val="22"/>
+                      <w:szCs w:val="22"/>
+                      <w:lang w:eastAsia="es-US"/>
+                      <w14:ligatures w14:val="none"/>
+                    </w:rPr>
+                    <w:t>Alto (3)</w:t>
+                  </w:r>
+                </w:p>
+              </w:tc>
+              <w:tc>
+                <w:tcPr>
+                  <w:tcW w:w="1484" w:type="dxa"/>
+                  <w:tcBorders>
+                    <w:top w:val="nil"/>
+                    <w:left w:val="nil"/>
+                    <w:bottom w:val="nil"/>
+                    <w:right w:val="nil"/>
+                  </w:tcBorders>
+                  <w:shd w:val="clear" w:color="auto" w:fill="auto"/>
+                  <w:noWrap/>
+                  <w:vAlign w:val="bottom"/>
+                  <w:hideMark/>
+                </w:tcPr>
+                <w:p>
+                  <w:pPr>
+                    <w:framePr w:hSpace="141" w:wrap="around" w:vAnchor="page" w:hAnchor="margin" w:xAlign="center" w:y="2065"/>
+                    <w:spacing w:after="0" w:line="240" w:lineRule="auto"/>
+                    <w:rPr>
+                      <w:rFonts w:ascii="Calibri" w:eastAsia="Times New Roman" w:hAnsi="Calibri" w:cs="Calibri"/>
+                      <w:color w:val="000000"/>
+                      <w:kern w:val="0"/>
+                      <w:sz w:val="22"/>
+                      <w:szCs w:val="22"/>
+                      <w:lang w:eastAsia="es-US"/>
+                      <w14:ligatures w14:val="none"/>
+                    </w:rPr>
+                  </w:pPr>
+                  <w:r>
+                    <w:rPr>
+                      <w:rFonts w:ascii="Calibri" w:eastAsia="Times New Roman" w:hAnsi="Calibri" w:cs="Calibri"/>
+                      <w:color w:val="000000"/>
+                      <w:kern w:val="0"/>
+                      <w:sz w:val="22"/>
+                      <w:szCs w:val="22"/>
+                      <w:lang w:eastAsia="es-US"/>
+                      <w14:ligatures w14:val="none"/>
+                    </w:rPr>
+                    <w:t>Media (3)</w:t>
+                  </w:r>
+                </w:p>
+              </w:tc>
+              <w:tc>
+                <w:tcPr>
+                  <w:tcW w:w="1396" w:type="dxa"/>
+                  <w:tcBorders>
+                    <w:top w:val="nil"/>
+                    <w:left w:val="nil"/>
+                    <w:bottom w:val="nil"/>
+                    <w:right w:val="nil"/>
+                  </w:tcBorders>
+                  <w:shd w:val="clear" w:color="auto" w:fill="auto"/>
+                  <w:noWrap/>
+                  <w:vAlign w:val="bottom"/>
+                  <w:hideMark/>
+                </w:tcPr>
+                <w:p>
+                  <w:pPr>
+                    <w:framePr w:hSpace="141" w:wrap="around" w:vAnchor="page" w:hAnchor="margin" w:xAlign="center" w:y="2065"/>
+                    <w:spacing w:after="0" w:line="240" w:lineRule="auto"/>
+                    <w:rPr>
+                      <w:rFonts w:ascii="Calibri" w:eastAsia="Times New Roman" w:hAnsi="Calibri" w:cs="Calibri"/>
+                      <w:color w:val="000000"/>
+                      <w:kern w:val="0"/>
+                      <w:sz w:val="22"/>
+                      <w:szCs w:val="22"/>
+                      <w:lang w:eastAsia="es-US"/>
+                      <w14:ligatures w14:val="none"/>
+                    </w:rPr>
+                  </w:pPr>
+                  <w:r>
+                    <w:rPr>
+                      <w:rFonts w:ascii="Calibri" w:eastAsia="Times New Roman" w:hAnsi="Calibri" w:cs="Calibri"/>
+                      <w:color w:val="000000"/>
+                      <w:kern w:val="0"/>
+                      <w:sz w:val="22"/>
+                      <w:szCs w:val="22"/>
+                      <w:lang w:eastAsia="es-US"/>
+                      <w14:ligatures w14:val="none"/>
+                    </w:rPr>
+                    <w:t>Alto (9)</w:t>
+                  </w:r>
+                </w:p>
+              </w:tc>
+            </w:tr>
+            <w:tr>
+              <w:trPr>
+                <w:trHeight w:val="250"/>
+              </w:trPr>
+              <w:tc>
+                <w:tcPr>
+                  <w:tcW w:w="6718" w:type="dxa"/>
+                  <w:tcBorders>
+                    <w:top w:val="nil"/>
+                    <w:left w:val="nil"/>
+                    <w:bottom w:val="nil"/>
+                    <w:right w:val="nil"/>
+                  </w:tcBorders>
+                  <w:shd w:val="clear" w:color="auto" w:fill="auto"/>
+                  <w:noWrap/>
+                  <w:vAlign w:val="bottom"/>
+                  <w:hideMark/>
+                </w:tcPr>
+                <w:p>
+                  <w:pPr>
+                    <w:framePr w:hSpace="141" w:wrap="around" w:vAnchor="page" w:hAnchor="margin" w:xAlign="center" w:y="2065"/>
+                    <w:spacing w:after="0" w:line="240" w:lineRule="auto"/>
+                    <w:rPr>
+                      <w:rFonts w:ascii="Calibri" w:eastAsia="Times New Roman" w:hAnsi="Calibri" w:cs="Calibri"/>
+                      <w:color w:val="000000"/>
+                      <w:kern w:val="0"/>
+                      <w:sz w:val="22"/>
+                      <w:szCs w:val="22"/>
+                      <w:lang w:eastAsia="es-US"/>
+                      <w14:ligatures w14:val="none"/>
+                    </w:rPr>
+                  </w:pPr>
+                  <w:r>
+                    <w:rPr>
+                      <w:rFonts w:ascii="Calibri" w:eastAsia="Times New Roman" w:hAnsi="Calibri" w:cs="Calibri"/>
+                      <w:color w:val="000000"/>
+                      <w:kern w:val="0"/>
+                      <w:sz w:val="22"/>
+                      <w:szCs w:val="22"/>
+                      <w:lang w:eastAsia="es-US"/>
+                      <w14:ligatures w14:val="none"/>
+                    </w:rPr>
+                    <w:t>R-RED-008: Fallo prematuro de switches por acumulación de polvo</w:t>
+                  </w:r>
+                </w:p>
+              </w:tc>
+              <w:tc>
+                <w:tcPr>
+                  <w:tcW w:w="1396" w:type="dxa"/>
+                  <w:tcBorders>
+                    <w:top w:val="nil"/>
+                    <w:left w:val="nil"/>
+                    <w:bottom w:val="nil"/>
+                    <w:right w:val="nil"/>
+                  </w:tcBorders>
+                  <w:shd w:val="clear" w:color="auto" w:fill="auto"/>
+                  <w:noWrap/>
+                  <w:vAlign w:val="bottom"/>
+                  <w:hideMark/>
+                </w:tcPr>
+                <w:p>
+                  <w:pPr>
+                    <w:framePr w:hSpace="141" w:wrap="around" w:vAnchor="page" w:hAnchor="margin" w:xAlign="center" w:y="2065"/>
+                    <w:spacing w:after="0" w:line="240" w:lineRule="auto"/>
+                    <w:rPr>
+                      <w:rFonts w:ascii="Calibri" w:eastAsia="Times New Roman" w:hAnsi="Calibri" w:cs="Calibri"/>
+                      <w:color w:val="000000"/>
+                      <w:kern w:val="0"/>
+                      <w:sz w:val="22"/>
+                      <w:szCs w:val="22"/>
+                      <w:lang w:eastAsia="es-US"/>
+                      <w14:ligatures w14:val="none"/>
+                    </w:rPr>
+                  </w:pPr>
+                  <w:r>
+                    <w:rPr>
+                      <w:rFonts w:ascii="Calibri" w:eastAsia="Times New Roman" w:hAnsi="Calibri" w:cs="Calibri"/>
+                      <w:color w:val="000000"/>
+                      <w:kern w:val="0"/>
+                      <w:sz w:val="22"/>
+                      <w:szCs w:val="22"/>
+                      <w:lang w:eastAsia="es-US"/>
+                      <w14:ligatures w14:val="none"/>
+                    </w:rPr>
+                    <w:t>Alto (3)</w:t>
+                  </w:r>
+                </w:p>
+              </w:tc>
+              <w:tc>
+                <w:tcPr>
+                  <w:tcW w:w="1484" w:type="dxa"/>
+                  <w:tcBorders>
+                    <w:top w:val="nil"/>
+                    <w:left w:val="nil"/>
+                    <w:bottom w:val="nil"/>
+                    <w:right w:val="nil"/>
+                  </w:tcBorders>
+                  <w:shd w:val="clear" w:color="auto" w:fill="auto"/>
+                  <w:noWrap/>
+                  <w:vAlign w:val="bottom"/>
+                  <w:hideMark/>
+                </w:tcPr>
+                <w:p>
+                  <w:pPr>
+                    <w:framePr w:hSpace="141" w:wrap="around" w:vAnchor="page" w:hAnchor="margin" w:xAlign="center" w:y="2065"/>
+                    <w:spacing w:after="0" w:line="240" w:lineRule="auto"/>
+                    <w:rPr>
+                      <w:rFonts w:ascii="Calibri" w:eastAsia="Times New Roman" w:hAnsi="Calibri" w:cs="Calibri"/>
+                      <w:color w:val="000000"/>
+                      <w:kern w:val="0"/>
+                      <w:sz w:val="22"/>
+                      <w:szCs w:val="22"/>
+                      <w:lang w:eastAsia="es-US"/>
+                      <w14:ligatures w14:val="none"/>
+                    </w:rPr>
+                  </w:pPr>
+                  <w:r>
+                    <w:rPr>
+                      <w:rFonts w:ascii="Calibri" w:eastAsia="Times New Roman" w:hAnsi="Calibri" w:cs="Calibri"/>
+                      <w:color w:val="000000"/>
+                      <w:kern w:val="0"/>
+                      <w:sz w:val="22"/>
+                      <w:szCs w:val="22"/>
+                      <w:lang w:eastAsia="es-US"/>
+                      <w14:ligatures w14:val="none"/>
+                    </w:rPr>
+                    <w:t>Alta (4)</w:t>
+                  </w:r>
+                </w:p>
+              </w:tc>
+              <w:tc>
+                <w:tcPr>
+                  <w:tcW w:w="1396" w:type="dxa"/>
+                  <w:tcBorders>
+                    <w:top w:val="nil"/>
+                    <w:left w:val="nil"/>
+                    <w:bottom w:val="nil"/>
+                    <w:right w:val="nil"/>
+                  </w:tcBorders>
+                  <w:shd w:val="clear" w:color="auto" w:fill="auto"/>
+                  <w:noWrap/>
+                  <w:vAlign w:val="bottom"/>
+                  <w:hideMark/>
+                </w:tcPr>
+                <w:p>
+                  <w:pPr>
+                    <w:framePr w:hSpace="141" w:wrap="around" w:vAnchor="page" w:hAnchor="margin" w:xAlign="center" w:y="2065"/>
+                    <w:spacing w:after="0" w:line="240" w:lineRule="auto"/>
+                    <w:rPr>
+                      <w:rFonts w:ascii="Calibri" w:eastAsia="Times New Roman" w:hAnsi="Calibri" w:cs="Calibri"/>
+                      <w:color w:val="000000"/>
+                      <w:kern w:val="0"/>
+                      <w:sz w:val="22"/>
+                      <w:szCs w:val="22"/>
+                      <w:lang w:eastAsia="es-US"/>
+                      <w14:ligatures w14:val="none"/>
+                    </w:rPr>
+                  </w:pPr>
+                  <w:r>
+                    <w:rPr>
+                      <w:rFonts w:ascii="Calibri" w:eastAsia="Times New Roman" w:hAnsi="Calibri" w:cs="Calibri"/>
+                      <w:color w:val="000000"/>
+                      <w:kern w:val="0"/>
+                      <w:sz w:val="22"/>
+                      <w:szCs w:val="22"/>
+                      <w:lang w:eastAsia="es-US"/>
+                      <w14:ligatures w14:val="none"/>
+                    </w:rPr>
+                    <w:t>Alto (12)</w:t>
+                  </w:r>
+                </w:p>
+              </w:tc>
+            </w:tr>
+          </w:tbl>
           <w:p/>
         </w:tc>
       </w:tr>
       <w:tr>
-        <w:tc>
-          <w:tcPr>
-            <w:tcW w:w="9350" w:type="dxa"/>
+        <w:trPr>
+          <w:trHeight w:val="260"/>
+        </w:trPr>
+        <w:tc>
+          <w:tcPr>
+            <w:tcW w:w="11255" w:type="dxa"/>
             <w:gridSpan w:val="7"/>
             <w:shd w:val="clear" w:color="auto" w:fill="D0CECE" w:themeFill="background2" w:themeFillShade="E6"/>
           </w:tcPr>
@@ -364,16 +1096,75 @@
         </w:tc>
       </w:tr>
       <w:tr>
-        <w:tc>
-          <w:tcPr>
-            <w:tcW w:w="9350" w:type="dxa"/>
+        <w:trPr>
+          <w:trHeight w:val="250"/>
+        </w:trPr>
+        <w:tc>
+          <w:tcPr>
+            <w:tcW w:w="11255" w:type="dxa"/>
             <w:gridSpan w:val="7"/>
             <w:shd w:val="clear" w:color="auto" w:fill="FFFFFF" w:themeFill="background1"/>
           </w:tcPr>
+          <w:p>
+            <w:pPr>
+              <w:numPr>
+                <w:ilvl w:val="0"/>
+                <w:numId w:val="5"/>
+              </w:numPr>
+            </w:pPr>
+            <w:r>
+              <w:rPr>
+                <w:b/>
+                <w:bCs/>
+              </w:rPr>
+              <w:t>Inmediata (0-15 días):</w:t>
+            </w:r>
+            <w:r>
+              <w:t> Adquirir e instalar un rack o gabinete de pared con cerradura en el área de Dirección para alojar los switches principales y su UPS.</w:t>
+            </w:r>
+          </w:p>
+          <w:p>
+            <w:pPr>
+              <w:numPr>
+                <w:ilvl w:val="0"/>
+                <w:numId w:val="5"/>
+              </w:numPr>
+            </w:pPr>
+            <w:r>
+              <w:rPr>
+                <w:b/>
+                <w:bCs/>
+              </w:rPr>
+              <w:t>Inmediata (0-15 días):</w:t>
+            </w:r>
+            <w:r>
+              <w:t> Adquirir e instalar un rack o gabinete de pared con cerradura en el área de Varios 1 para alojar el switch secundario y su UPS.</w:t>
+            </w:r>
+          </w:p>
+          <w:p>
+            <w:pPr>
+              <w:numPr>
+                <w:ilvl w:val="0"/>
+                <w:numId w:val="5"/>
+              </w:numPr>
+            </w:pPr>
+            <w:r>
+              <w:rPr>
+                <w:b/>
+                <w:bCs/>
+              </w:rPr>
+              <w:lastRenderedPageBreak/>
+              <w:t>Corto plazo (30-60 días):</w:t>
+            </w:r>
+            <w:r>
+              <w:t> Designar formalmente a un responsable de la administración de la red que tenga entre sus funciones el control de acceso físico a los dispositivos de comunicación.</w:t>
+            </w:r>
+          </w:p>
           <w:p/>
         </w:tc>
       </w:tr>
     </w:tbl>
+    <w:p/>
     <w:p/>
     <w:sectPr>
       <w:pgSz w:w="12240" w:h="15840"/>
@@ -383,6 +1174,725 @@
     </w:sectPr>
   </w:body>
 </w:document>
+</file>
+
+<file path=word/endnotes.xml><?xml version="1.0" encoding="utf-8"?>
+<w:endnotes xmlns:wpc="http://schemas.microsoft.com/office/word/2010/wordprocessingCanvas" xmlns:cx="http://schemas.microsoft.com/office/drawing/2014/chartex" xmlns:cx1="http://schemas.microsoft.com/office/drawing/2015/9/8/chartex" xmlns:cx2="http://schemas.microsoft.com/office/drawing/2015/10/21/chartex" xmlns:cx3="http://schemas.microsoft.com/office/drawing/2016/5/9/chartex" xmlns:cx4="http://schemas.microsoft.com/office/drawing/2016/5/10/chartex" xmlns:cx5="http://schemas.microsoft.com/office/drawing/2016/5/11/chartex" xmlns:cx6="http://schemas.microsoft.com/office/drawing/2016/5/12/chartex" xmlns:cx7="http://schemas.microsoft.com/office/drawing/2016/5/13/chartex" xmlns:cx8="http://schemas.microsoft.com/office/drawing/2016/5/14/chartex" xmlns:mc="http://schemas.openxmlformats.org/markup-compatibility/2006" xmlns:aink="http://schemas.microsoft.com/office/drawing/2016/ink" xmlns:am3d="http://schemas.microsoft.com/office/drawing/2017/model3d" xmlns:o="urn:schemas-microsoft-com:office:office" xmlns:r="http://schemas.openxmlformats.org/officeDocument/2006/relationships" xmlns:m="http://schemas.openxmlformats.org/officeDocument/2006/math" xmlns:v="urn:schemas-microsoft-com:vml" xmlns:wp14="http://schemas.microsoft.com/office/word/2010/wordprocessingDrawing" xmlns:wp="http://schemas.openxmlformats.org/drawingml/2006/wordprocessingDrawing" xmlns:w10="urn:schemas-microsoft-com:office:word" xmlns:w="http://schemas.openxmlformats.org/wordprocessingml/2006/main" xmlns:w14="http://schemas.microsoft.com/office/word/2010/wordml" xmlns:w15="http://schemas.microsoft.com/office/word/2012/wordml" xmlns:w16cex="http://schemas.microsoft.com/office/word/2018/wordml/cex" xmlns:w16cid="http://schemas.microsoft.com/office/word/2016/wordml/cid" xmlns:w16="http://schemas.microsoft.com/office/word/2018/wordml" xmlns:w16sdtdh="http://schemas.microsoft.com/office/word/2020/wordml/sdtdatahash" xmlns:w16se="http://schemas.microsoft.com/office/word/2015/wordml/symex" xmlns:wpg="http://schemas.microsoft.com/office/word/2010/wordprocessingGroup" xmlns:wpi="http://schemas.microsoft.com/office/word/2010/wordprocessingInk" xmlns:wne="http://schemas.microsoft.com/office/word/2006/wordml" xmlns:wps="http://schemas.microsoft.com/office/word/2010/wordprocessingShape" mc:Ignorable="w14 w15 w16se w16cid w16 w16cex w16sdtdh wp14">
+  <w:endnote w:type="separator" w:id="-1">
+    <w:p>
+      <w:pPr>
+        <w:spacing w:after="0" w:line="240" w:lineRule="auto"/>
+      </w:pPr>
+      <w:r>
+        <w:separator/>
+      </w:r>
+    </w:p>
+  </w:endnote>
+  <w:endnote w:type="continuationSeparator" w:id="0">
+    <w:p>
+      <w:pPr>
+        <w:spacing w:after="0" w:line="240" w:lineRule="auto"/>
+      </w:pPr>
+      <w:r>
+        <w:continuationSeparator/>
+      </w:r>
+    </w:p>
+  </w:endnote>
+</w:endnotes>
+</file>
+
+<file path=word/footnotes.xml><?xml version="1.0" encoding="utf-8"?>
+<w:footnotes xmlns:wpc="http://schemas.microsoft.com/office/word/2010/wordprocessingCanvas" xmlns:cx="http://schemas.microsoft.com/office/drawing/2014/chartex" xmlns:cx1="http://schemas.microsoft.com/office/drawing/2015/9/8/chartex" xmlns:cx2="http://schemas.microsoft.com/office/drawing/2015/10/21/chartex" xmlns:cx3="http://schemas.microsoft.com/office/drawing/2016/5/9/chartex" xmlns:cx4="http://schemas.microsoft.com/office/drawing/2016/5/10/chartex" xmlns:cx5="http://schemas.microsoft.com/office/drawing/2016/5/11/chartex" xmlns:cx6="http://schemas.microsoft.com/office/drawing/2016/5/12/chartex" xmlns:cx7="http://schemas.microsoft.com/office/drawing/2016/5/13/chartex" xmlns:cx8="http://schemas.microsoft.com/office/drawing/2016/5/14/chartex" xmlns:mc="http://schemas.openxmlformats.org/markup-compatibility/2006" xmlns:aink="http://schemas.microsoft.com/office/drawing/2016/ink" xmlns:am3d="http://schemas.microsoft.com/office/drawing/2017/model3d" xmlns:o="urn:schemas-microsoft-com:office:office" xmlns:r="http://schemas.openxmlformats.org/officeDocument/2006/relationships" xmlns:m="http://schemas.openxmlformats.org/officeDocument/2006/math" xmlns:v="urn:schemas-microsoft-com:vml" xmlns:wp14="http://schemas.microsoft.com/office/word/2010/wordprocessingDrawing" xmlns:wp="http://schemas.openxmlformats.org/drawingml/2006/wordprocessingDrawing" xmlns:w10="urn:schemas-microsoft-com:office:word" xmlns:w="http://schemas.openxmlformats.org/wordprocessingml/2006/main" xmlns:w14="http://schemas.microsoft.com/office/word/2010/wordml" xmlns:w15="http://schemas.microsoft.com/office/word/2012/wordml" xmlns:w16cex="http://schemas.microsoft.com/office/word/2018/wordml/cex" xmlns:w16cid="http://schemas.microsoft.com/office/word/2016/wordml/cid" xmlns:w16="http://schemas.microsoft.com/office/word/2018/wordml" xmlns:w16sdtdh="http://schemas.microsoft.com/office/word/2020/wordml/sdtdatahash" xmlns:w16se="http://schemas.microsoft.com/office/word/2015/wordml/symex" xmlns:wpg="http://schemas.microsoft.com/office/word/2010/wordprocessingGroup" xmlns:wpi="http://schemas.microsoft.com/office/word/2010/wordprocessingInk" xmlns:wne="http://schemas.microsoft.com/office/word/2006/wordml" xmlns:wps="http://schemas.microsoft.com/office/word/2010/wordprocessingShape" mc:Ignorable="w14 w15 w16se w16cid w16 w16cex w16sdtdh wp14">
+  <w:footnote w:type="separator" w:id="-1">
+    <w:p>
+      <w:pPr>
+        <w:spacing w:after="0" w:line="240" w:lineRule="auto"/>
+      </w:pPr>
+      <w:r>
+        <w:separator/>
+      </w:r>
+    </w:p>
+  </w:footnote>
+  <w:footnote w:type="continuationSeparator" w:id="0">
+    <w:p>
+      <w:pPr>
+        <w:spacing w:after="0" w:line="240" w:lineRule="auto"/>
+      </w:pPr>
+      <w:r>
+        <w:continuationSeparator/>
+      </w:r>
+    </w:p>
+  </w:footnote>
+</w:footnotes>
+</file>
+
+<file path=word/numbering.xml><?xml version="1.0" encoding="utf-8"?>
+<w:numbering xmlns:wpc="http://schemas.microsoft.com/office/word/2010/wordprocessingCanvas" xmlns:cx="http://schemas.microsoft.com/office/drawing/2014/chartex" xmlns:cx1="http://schemas.microsoft.com/office/drawing/2015/9/8/chartex" xmlns:cx2="http://schemas.microsoft.com/office/drawing/2015/10/21/chartex" xmlns:cx3="http://schemas.microsoft.com/office/drawing/2016/5/9/chartex" xmlns:cx4="http://schemas.microsoft.com/office/drawing/2016/5/10/chartex" xmlns:cx5="http://schemas.microsoft.com/office/drawing/2016/5/11/chartex" xmlns:cx6="http://schemas.microsoft.com/office/drawing/2016/5/12/chartex" xmlns:cx7="http://schemas.microsoft.com/office/drawing/2016/5/13/chartex" xmlns:cx8="http://schemas.microsoft.com/office/drawing/2016/5/14/chartex" xmlns:mc="http://schemas.openxmlformats.org/markup-compatibility/2006" xmlns:aink="http://schemas.microsoft.com/office/drawing/2016/ink" xmlns:am3d="http://schemas.microsoft.com/office/drawing/2017/model3d" xmlns:o="urn:schemas-microsoft-com:office:office" xmlns:r="http://schemas.openxmlformats.org/officeDocument/2006/relationships" xmlns:m="http://schemas.openxmlformats.org/officeDocument/2006/math" xmlns:v="urn:schemas-microsoft-com:vml" xmlns:wp14="http://schemas.microsoft.com/office/word/2010/wordprocessingDrawing" xmlns:wp="http://schemas.openxmlformats.org/drawingml/2006/wordprocessingDrawing" xmlns:w10="urn:schemas-microsoft-com:office:word" xmlns:w="http://schemas.openxmlformats.org/wordprocessingml/2006/main" xmlns:w14="http://schemas.microsoft.com/office/word/2010/wordml" xmlns:w15="http://schemas.microsoft.com/office/word/2012/wordml" xmlns:w16cex="http://schemas.microsoft.com/office/word/2018/wordml/cex" xmlns:w16cid="http://schemas.microsoft.com/office/word/2016/wordml/cid" xmlns:w16="http://schemas.microsoft.com/office/word/2018/wordml" xmlns:w16sdtdh="http://schemas.microsoft.com/office/word/2020/wordml/sdtdatahash" xmlns:w16se="http://schemas.microsoft.com/office/word/2015/wordml/symex" xmlns:wpg="http://schemas.microsoft.com/office/word/2010/wordprocessingGroup" xmlns:wpi="http://schemas.microsoft.com/office/word/2010/wordprocessingInk" xmlns:wne="http://schemas.microsoft.com/office/word/2006/wordml" xmlns:wps="http://schemas.microsoft.com/office/word/2010/wordprocessingShape" mc:Ignorable="w14 w15 w16se w16cid w16 w16cex w16sdtdh wp14">
+  <w:abstractNum w:abstractNumId="0" w15:restartNumberingAfterBreak="0">
+    <w:nsid w:val="02066222"/>
+    <w:multiLevelType w:val="hybridMultilevel"/>
+    <w:tmpl w:val="73A4BAE4"/>
+    <w:lvl w:ilvl="0" w:tplc="C6FE99FA">
+      <w:start w:val="1"/>
+      <w:numFmt w:val="upperRoman"/>
+      <w:lvlText w:val="%1."/>
+      <w:lvlJc w:val="left"/>
+      <w:pPr>
+        <w:ind w:left="1080" w:hanging="720"/>
+      </w:pPr>
+      <w:rPr>
+        <w:rFonts w:hint="default"/>
+      </w:rPr>
+    </w:lvl>
+    <w:lvl w:ilvl="1" w:tplc="540A0019" w:tentative="1">
+      <w:start w:val="1"/>
+      <w:numFmt w:val="lowerLetter"/>
+      <w:lvlText w:val="%2."/>
+      <w:lvlJc w:val="left"/>
+      <w:pPr>
+        <w:ind w:left="1440" w:hanging="360"/>
+      </w:pPr>
+    </w:lvl>
+    <w:lvl w:ilvl="2" w:tplc="540A001B" w:tentative="1">
+      <w:start w:val="1"/>
+      <w:numFmt w:val="lowerRoman"/>
+      <w:lvlText w:val="%3."/>
+      <w:lvlJc w:val="right"/>
+      <w:pPr>
+        <w:ind w:left="2160" w:hanging="180"/>
+      </w:pPr>
+    </w:lvl>
+    <w:lvl w:ilvl="3" w:tplc="540A000F" w:tentative="1">
+      <w:start w:val="1"/>
+      <w:numFmt w:val="decimal"/>
+      <w:lvlText w:val="%4."/>
+      <w:lvlJc w:val="left"/>
+      <w:pPr>
+        <w:ind w:left="2880" w:hanging="360"/>
+      </w:pPr>
+    </w:lvl>
+    <w:lvl w:ilvl="4" w:tplc="540A0019" w:tentative="1">
+      <w:start w:val="1"/>
+      <w:numFmt w:val="lowerLetter"/>
+      <w:lvlText w:val="%5."/>
+      <w:lvlJc w:val="left"/>
+      <w:pPr>
+        <w:ind w:left="3600" w:hanging="360"/>
+      </w:pPr>
+    </w:lvl>
+    <w:lvl w:ilvl="5" w:tplc="540A001B" w:tentative="1">
+      <w:start w:val="1"/>
+      <w:numFmt w:val="lowerRoman"/>
+      <w:lvlText w:val="%6."/>
+      <w:lvlJc w:val="right"/>
+      <w:pPr>
+        <w:ind w:left="4320" w:hanging="180"/>
+      </w:pPr>
+    </w:lvl>
+    <w:lvl w:ilvl="6" w:tplc="540A000F" w:tentative="1">
+      <w:start w:val="1"/>
+      <w:numFmt w:val="decimal"/>
+      <w:lvlText w:val="%7."/>
+      <w:lvlJc w:val="left"/>
+      <w:pPr>
+        <w:ind w:left="5040" w:hanging="360"/>
+      </w:pPr>
+    </w:lvl>
+    <w:lvl w:ilvl="7" w:tplc="540A0019" w:tentative="1">
+      <w:start w:val="1"/>
+      <w:numFmt w:val="lowerLetter"/>
+      <w:lvlText w:val="%8."/>
+      <w:lvlJc w:val="left"/>
+      <w:pPr>
+        <w:ind w:left="5760" w:hanging="360"/>
+      </w:pPr>
+    </w:lvl>
+    <w:lvl w:ilvl="8" w:tplc="540A001B" w:tentative="1">
+      <w:start w:val="1"/>
+      <w:numFmt w:val="lowerRoman"/>
+      <w:lvlText w:val="%9."/>
+      <w:lvlJc w:val="right"/>
+      <w:pPr>
+        <w:ind w:left="6480" w:hanging="180"/>
+      </w:pPr>
+    </w:lvl>
+  </w:abstractNum>
+  <w:abstractNum w:abstractNumId="1" w15:restartNumberingAfterBreak="0">
+    <w:nsid w:val="0C3749DD"/>
+    <w:multiLevelType w:val="multilevel"/>
+    <w:tmpl w:val="C84CA5B6"/>
+    <w:lvl w:ilvl="0">
+      <w:start w:val="1"/>
+      <w:numFmt w:val="decimal"/>
+      <w:lvlText w:val="%1."/>
+      <w:lvlJc w:val="left"/>
+      <w:pPr>
+        <w:tabs>
+          <w:tab w:val="num" w:pos="720"/>
+        </w:tabs>
+        <w:ind w:left="720" w:hanging="360"/>
+      </w:pPr>
+    </w:lvl>
+    <w:lvl w:ilvl="1" w:tentative="1">
+      <w:start w:val="1"/>
+      <w:numFmt w:val="decimal"/>
+      <w:lvlText w:val="%2."/>
+      <w:lvlJc w:val="left"/>
+      <w:pPr>
+        <w:tabs>
+          <w:tab w:val="num" w:pos="1440"/>
+        </w:tabs>
+        <w:ind w:left="1440" w:hanging="360"/>
+      </w:pPr>
+    </w:lvl>
+    <w:lvl w:ilvl="2" w:tentative="1">
+      <w:start w:val="1"/>
+      <w:numFmt w:val="decimal"/>
+      <w:lvlText w:val="%3."/>
+      <w:lvlJc w:val="left"/>
+      <w:pPr>
+        <w:tabs>
+          <w:tab w:val="num" w:pos="2160"/>
+        </w:tabs>
+        <w:ind w:left="2160" w:hanging="360"/>
+      </w:pPr>
+    </w:lvl>
+    <w:lvl w:ilvl="3" w:tentative="1">
+      <w:start w:val="1"/>
+      <w:numFmt w:val="decimal"/>
+      <w:lvlText w:val="%4."/>
+      <w:lvlJc w:val="left"/>
+      <w:pPr>
+        <w:tabs>
+          <w:tab w:val="num" w:pos="2880"/>
+        </w:tabs>
+        <w:ind w:left="2880" w:hanging="360"/>
+      </w:pPr>
+    </w:lvl>
+    <w:lvl w:ilvl="4" w:tentative="1">
+      <w:start w:val="1"/>
+      <w:numFmt w:val="decimal"/>
+      <w:lvlText w:val="%5."/>
+      <w:lvlJc w:val="left"/>
+      <w:pPr>
+        <w:tabs>
+          <w:tab w:val="num" w:pos="3600"/>
+        </w:tabs>
+        <w:ind w:left="3600" w:hanging="360"/>
+      </w:pPr>
+    </w:lvl>
+    <w:lvl w:ilvl="5" w:tentative="1">
+      <w:start w:val="1"/>
+      <w:numFmt w:val="decimal"/>
+      <w:lvlText w:val="%6."/>
+      <w:lvlJc w:val="left"/>
+      <w:pPr>
+        <w:tabs>
+          <w:tab w:val="num" w:pos="4320"/>
+        </w:tabs>
+        <w:ind w:left="4320" w:hanging="360"/>
+      </w:pPr>
+    </w:lvl>
+    <w:lvl w:ilvl="6" w:tentative="1">
+      <w:start w:val="1"/>
+      <w:numFmt w:val="decimal"/>
+      <w:lvlText w:val="%7."/>
+      <w:lvlJc w:val="left"/>
+      <w:pPr>
+        <w:tabs>
+          <w:tab w:val="num" w:pos="5040"/>
+        </w:tabs>
+        <w:ind w:left="5040" w:hanging="360"/>
+      </w:pPr>
+    </w:lvl>
+    <w:lvl w:ilvl="7" w:tentative="1">
+      <w:start w:val="1"/>
+      <w:numFmt w:val="decimal"/>
+      <w:lvlText w:val="%8."/>
+      <w:lvlJc w:val="left"/>
+      <w:pPr>
+        <w:tabs>
+          <w:tab w:val="num" w:pos="5760"/>
+        </w:tabs>
+        <w:ind w:left="5760" w:hanging="360"/>
+      </w:pPr>
+    </w:lvl>
+    <w:lvl w:ilvl="8" w:tentative="1">
+      <w:start w:val="1"/>
+      <w:numFmt w:val="decimal"/>
+      <w:lvlText w:val="%9."/>
+      <w:lvlJc w:val="left"/>
+      <w:pPr>
+        <w:tabs>
+          <w:tab w:val="num" w:pos="6480"/>
+        </w:tabs>
+        <w:ind w:left="6480" w:hanging="360"/>
+      </w:pPr>
+    </w:lvl>
+  </w:abstractNum>
+  <w:abstractNum w:abstractNumId="2" w15:restartNumberingAfterBreak="0">
+    <w:nsid w:val="4C5F220E"/>
+    <w:multiLevelType w:val="multilevel"/>
+    <w:tmpl w:val="476A2484"/>
+    <w:lvl w:ilvl="0">
+      <w:start w:val="1"/>
+      <w:numFmt w:val="bullet"/>
+      <w:lvlText w:val=""/>
+      <w:lvlJc w:val="left"/>
+      <w:pPr>
+        <w:tabs>
+          <w:tab w:val="num" w:pos="720"/>
+        </w:tabs>
+        <w:ind w:left="720" w:hanging="360"/>
+      </w:pPr>
+      <w:rPr>
+        <w:rFonts w:ascii="Symbol" w:hAnsi="Symbol" w:hint="default"/>
+        <w:sz w:val="20"/>
+      </w:rPr>
+    </w:lvl>
+    <w:lvl w:ilvl="1" w:tentative="1">
+      <w:start w:val="1"/>
+      <w:numFmt w:val="bullet"/>
+      <w:lvlText w:val="o"/>
+      <w:lvlJc w:val="left"/>
+      <w:pPr>
+        <w:tabs>
+          <w:tab w:val="num" w:pos="1440"/>
+        </w:tabs>
+        <w:ind w:left="1440" w:hanging="360"/>
+      </w:pPr>
+      <w:rPr>
+        <w:rFonts w:ascii="Courier New" w:hAnsi="Courier New" w:hint="default"/>
+        <w:sz w:val="20"/>
+      </w:rPr>
+    </w:lvl>
+    <w:lvl w:ilvl="2" w:tentative="1">
+      <w:start w:val="1"/>
+      <w:numFmt w:val="bullet"/>
+      <w:lvlText w:val=""/>
+      <w:lvlJc w:val="left"/>
+      <w:pPr>
+        <w:tabs>
+          <w:tab w:val="num" w:pos="2160"/>
+        </w:tabs>
+        <w:ind w:left="2160" w:hanging="360"/>
+      </w:pPr>
+      <w:rPr>
+        <w:rFonts w:ascii="Wingdings" w:hAnsi="Wingdings" w:hint="default"/>
+        <w:sz w:val="20"/>
+      </w:rPr>
+    </w:lvl>
+    <w:lvl w:ilvl="3" w:tentative="1">
+      <w:start w:val="1"/>
+      <w:numFmt w:val="bullet"/>
+      <w:lvlText w:val=""/>
+      <w:lvlJc w:val="left"/>
+      <w:pPr>
+        <w:tabs>
+          <w:tab w:val="num" w:pos="2880"/>
+        </w:tabs>
+        <w:ind w:left="2880" w:hanging="360"/>
+      </w:pPr>
+      <w:rPr>
+        <w:rFonts w:ascii="Wingdings" w:hAnsi="Wingdings" w:hint="default"/>
+        <w:sz w:val="20"/>
+      </w:rPr>
+    </w:lvl>
+    <w:lvl w:ilvl="4" w:tentative="1">
+      <w:start w:val="1"/>
+      <w:numFmt w:val="bullet"/>
+      <w:lvlText w:val=""/>
+      <w:lvlJc w:val="left"/>
+      <w:pPr>
+        <w:tabs>
+          <w:tab w:val="num" w:pos="3600"/>
+        </w:tabs>
+        <w:ind w:left="3600" w:hanging="360"/>
+      </w:pPr>
+      <w:rPr>
+        <w:rFonts w:ascii="Wingdings" w:hAnsi="Wingdings" w:hint="default"/>
+        <w:sz w:val="20"/>
+      </w:rPr>
+    </w:lvl>
+    <w:lvl w:ilvl="5" w:tentative="1">
+      <w:start w:val="1"/>
+      <w:numFmt w:val="bullet"/>
+      <w:lvlText w:val=""/>
+      <w:lvlJc w:val="left"/>
+      <w:pPr>
+        <w:tabs>
+          <w:tab w:val="num" w:pos="4320"/>
+        </w:tabs>
+        <w:ind w:left="4320" w:hanging="360"/>
+      </w:pPr>
+      <w:rPr>
+        <w:rFonts w:ascii="Wingdings" w:hAnsi="Wingdings" w:hint="default"/>
+        <w:sz w:val="20"/>
+      </w:rPr>
+    </w:lvl>
+    <w:lvl w:ilvl="6" w:tentative="1">
+      <w:start w:val="1"/>
+      <w:numFmt w:val="bullet"/>
+      <w:lvlText w:val=""/>
+      <w:lvlJc w:val="left"/>
+      <w:pPr>
+        <w:tabs>
+          <w:tab w:val="num" w:pos="5040"/>
+        </w:tabs>
+        <w:ind w:left="5040" w:hanging="360"/>
+      </w:pPr>
+      <w:rPr>
+        <w:rFonts w:ascii="Wingdings" w:hAnsi="Wingdings" w:hint="default"/>
+        <w:sz w:val="20"/>
+      </w:rPr>
+    </w:lvl>
+    <w:lvl w:ilvl="7" w:tentative="1">
+      <w:start w:val="1"/>
+      <w:numFmt w:val="bullet"/>
+      <w:lvlText w:val=""/>
+      <w:lvlJc w:val="left"/>
+      <w:pPr>
+        <w:tabs>
+          <w:tab w:val="num" w:pos="5760"/>
+        </w:tabs>
+        <w:ind w:left="5760" w:hanging="360"/>
+      </w:pPr>
+      <w:rPr>
+        <w:rFonts w:ascii="Wingdings" w:hAnsi="Wingdings" w:hint="default"/>
+        <w:sz w:val="20"/>
+      </w:rPr>
+    </w:lvl>
+    <w:lvl w:ilvl="8" w:tentative="1">
+      <w:start w:val="1"/>
+      <w:numFmt w:val="bullet"/>
+      <w:lvlText w:val=""/>
+      <w:lvlJc w:val="left"/>
+      <w:pPr>
+        <w:tabs>
+          <w:tab w:val="num" w:pos="6480"/>
+        </w:tabs>
+        <w:ind w:left="6480" w:hanging="360"/>
+      </w:pPr>
+      <w:rPr>
+        <w:rFonts w:ascii="Wingdings" w:hAnsi="Wingdings" w:hint="default"/>
+        <w:sz w:val="20"/>
+      </w:rPr>
+    </w:lvl>
+  </w:abstractNum>
+  <w:abstractNum w:abstractNumId="3" w15:restartNumberingAfterBreak="0">
+    <w:nsid w:val="55CE7551"/>
+    <w:multiLevelType w:val="multilevel"/>
+    <w:tmpl w:val="DC565FB2"/>
+    <w:lvl w:ilvl="0">
+      <w:start w:val="1"/>
+      <w:numFmt w:val="bullet"/>
+      <w:lvlText w:val=""/>
+      <w:lvlJc w:val="left"/>
+      <w:pPr>
+        <w:tabs>
+          <w:tab w:val="num" w:pos="720"/>
+        </w:tabs>
+        <w:ind w:left="720" w:hanging="360"/>
+      </w:pPr>
+      <w:rPr>
+        <w:rFonts w:ascii="Symbol" w:hAnsi="Symbol" w:hint="default"/>
+        <w:sz w:val="20"/>
+      </w:rPr>
+    </w:lvl>
+    <w:lvl w:ilvl="1" w:tentative="1">
+      <w:start w:val="1"/>
+      <w:numFmt w:val="bullet"/>
+      <w:lvlText w:val="o"/>
+      <w:lvlJc w:val="left"/>
+      <w:pPr>
+        <w:tabs>
+          <w:tab w:val="num" w:pos="1440"/>
+        </w:tabs>
+        <w:ind w:left="1440" w:hanging="360"/>
+      </w:pPr>
+      <w:rPr>
+        <w:rFonts w:ascii="Courier New" w:hAnsi="Courier New" w:hint="default"/>
+        <w:sz w:val="20"/>
+      </w:rPr>
+    </w:lvl>
+    <w:lvl w:ilvl="2" w:tentative="1">
+      <w:start w:val="1"/>
+      <w:numFmt w:val="bullet"/>
+      <w:lvlText w:val=""/>
+      <w:lvlJc w:val="left"/>
+      <w:pPr>
+        <w:tabs>
+          <w:tab w:val="num" w:pos="2160"/>
+        </w:tabs>
+        <w:ind w:left="2160" w:hanging="360"/>
+      </w:pPr>
+      <w:rPr>
+        <w:rFonts w:ascii="Wingdings" w:hAnsi="Wingdings" w:hint="default"/>
+        <w:sz w:val="20"/>
+      </w:rPr>
+    </w:lvl>
+    <w:lvl w:ilvl="3" w:tentative="1">
+      <w:start w:val="1"/>
+      <w:numFmt w:val="bullet"/>
+      <w:lvlText w:val=""/>
+      <w:lvlJc w:val="left"/>
+      <w:pPr>
+        <w:tabs>
+          <w:tab w:val="num" w:pos="2880"/>
+        </w:tabs>
+        <w:ind w:left="2880" w:hanging="360"/>
+      </w:pPr>
+      <w:rPr>
+        <w:rFonts w:ascii="Wingdings" w:hAnsi="Wingdings" w:hint="default"/>
+        <w:sz w:val="20"/>
+      </w:rPr>
+    </w:lvl>
+    <w:lvl w:ilvl="4" w:tentative="1">
+      <w:start w:val="1"/>
+      <w:numFmt w:val="bullet"/>
+      <w:lvlText w:val=""/>
+      <w:lvlJc w:val="left"/>
+      <w:pPr>
+        <w:tabs>
+          <w:tab w:val="num" w:pos="3600"/>
+        </w:tabs>
+        <w:ind w:left="3600" w:hanging="360"/>
+      </w:pPr>
+      <w:rPr>
+        <w:rFonts w:ascii="Wingdings" w:hAnsi="Wingdings" w:hint="default"/>
+        <w:sz w:val="20"/>
+      </w:rPr>
+    </w:lvl>
+    <w:lvl w:ilvl="5" w:tentative="1">
+      <w:start w:val="1"/>
+      <w:numFmt w:val="bullet"/>
+      <w:lvlText w:val=""/>
+      <w:lvlJc w:val="left"/>
+      <w:pPr>
+        <w:tabs>
+          <w:tab w:val="num" w:pos="4320"/>
+        </w:tabs>
+        <w:ind w:left="4320" w:hanging="360"/>
+      </w:pPr>
+      <w:rPr>
+        <w:rFonts w:ascii="Wingdings" w:hAnsi="Wingdings" w:hint="default"/>
+        <w:sz w:val="20"/>
+      </w:rPr>
+    </w:lvl>
+    <w:lvl w:ilvl="6" w:tentative="1">
+      <w:start w:val="1"/>
+      <w:numFmt w:val="bullet"/>
+      <w:lvlText w:val=""/>
+      <w:lvlJc w:val="left"/>
+      <w:pPr>
+        <w:tabs>
+          <w:tab w:val="num" w:pos="5040"/>
+        </w:tabs>
+        <w:ind w:left="5040" w:hanging="360"/>
+      </w:pPr>
+      <w:rPr>
+        <w:rFonts w:ascii="Wingdings" w:hAnsi="Wingdings" w:hint="default"/>
+        <w:sz w:val="20"/>
+      </w:rPr>
+    </w:lvl>
+    <w:lvl w:ilvl="7" w:tentative="1">
+      <w:start w:val="1"/>
+      <w:numFmt w:val="bullet"/>
+      <w:lvlText w:val=""/>
+      <w:lvlJc w:val="left"/>
+      <w:pPr>
+        <w:tabs>
+          <w:tab w:val="num" w:pos="5760"/>
+        </w:tabs>
+        <w:ind w:left="5760" w:hanging="360"/>
+      </w:pPr>
+      <w:rPr>
+        <w:rFonts w:ascii="Wingdings" w:hAnsi="Wingdings" w:hint="default"/>
+        <w:sz w:val="20"/>
+      </w:rPr>
+    </w:lvl>
+    <w:lvl w:ilvl="8" w:tentative="1">
+      <w:start w:val="1"/>
+      <w:numFmt w:val="bullet"/>
+      <w:lvlText w:val=""/>
+      <w:lvlJc w:val="left"/>
+      <w:pPr>
+        <w:tabs>
+          <w:tab w:val="num" w:pos="6480"/>
+        </w:tabs>
+        <w:ind w:left="6480" w:hanging="360"/>
+      </w:pPr>
+      <w:rPr>
+        <w:rFonts w:ascii="Wingdings" w:hAnsi="Wingdings" w:hint="default"/>
+        <w:sz w:val="20"/>
+      </w:rPr>
+    </w:lvl>
+  </w:abstractNum>
+  <w:abstractNum w:abstractNumId="4" w15:restartNumberingAfterBreak="0">
+    <w:nsid w:val="6D2A3EA6"/>
+    <w:multiLevelType w:val="multilevel"/>
+    <w:tmpl w:val="3136751C"/>
+    <w:lvl w:ilvl="0">
+      <w:start w:val="1"/>
+      <w:numFmt w:val="bullet"/>
+      <w:lvlText w:val=""/>
+      <w:lvlJc w:val="left"/>
+      <w:pPr>
+        <w:tabs>
+          <w:tab w:val="num" w:pos="720"/>
+        </w:tabs>
+        <w:ind w:left="720" w:hanging="360"/>
+      </w:pPr>
+      <w:rPr>
+        <w:rFonts w:ascii="Symbol" w:hAnsi="Symbol" w:hint="default"/>
+        <w:sz w:val="20"/>
+      </w:rPr>
+    </w:lvl>
+    <w:lvl w:ilvl="1" w:tentative="1">
+      <w:start w:val="1"/>
+      <w:numFmt w:val="bullet"/>
+      <w:lvlText w:val="o"/>
+      <w:lvlJc w:val="left"/>
+      <w:pPr>
+        <w:tabs>
+          <w:tab w:val="num" w:pos="1440"/>
+        </w:tabs>
+        <w:ind w:left="1440" w:hanging="360"/>
+      </w:pPr>
+      <w:rPr>
+        <w:rFonts w:ascii="Courier New" w:hAnsi="Courier New" w:hint="default"/>
+        <w:sz w:val="20"/>
+      </w:rPr>
+    </w:lvl>
+    <w:lvl w:ilvl="2" w:tentative="1">
+      <w:start w:val="1"/>
+      <w:numFmt w:val="bullet"/>
+      <w:lvlText w:val=""/>
+      <w:lvlJc w:val="left"/>
+      <w:pPr>
+        <w:tabs>
+          <w:tab w:val="num" w:pos="2160"/>
+        </w:tabs>
+        <w:ind w:left="2160" w:hanging="360"/>
+      </w:pPr>
+      <w:rPr>
+        <w:rFonts w:ascii="Wingdings" w:hAnsi="Wingdings" w:hint="default"/>
+        <w:sz w:val="20"/>
+      </w:rPr>
+    </w:lvl>
+    <w:lvl w:ilvl="3" w:tentative="1">
+      <w:start w:val="1"/>
+      <w:numFmt w:val="bullet"/>
+      <w:lvlText w:val=""/>
+      <w:lvlJc w:val="left"/>
+      <w:pPr>
+        <w:tabs>
+          <w:tab w:val="num" w:pos="2880"/>
+        </w:tabs>
+        <w:ind w:left="2880" w:hanging="360"/>
+      </w:pPr>
+      <w:rPr>
+        <w:rFonts w:ascii="Wingdings" w:hAnsi="Wingdings" w:hint="default"/>
+        <w:sz w:val="20"/>
+      </w:rPr>
+    </w:lvl>
+    <w:lvl w:ilvl="4" w:tentative="1">
+      <w:start w:val="1"/>
+      <w:numFmt w:val="bullet"/>
+      <w:lvlText w:val=""/>
+      <w:lvlJc w:val="left"/>
+      <w:pPr>
+        <w:tabs>
+          <w:tab w:val="num" w:pos="3600"/>
+        </w:tabs>
+        <w:ind w:left="3600" w:hanging="360"/>
+      </w:pPr>
+      <w:rPr>
+        <w:rFonts w:ascii="Wingdings" w:hAnsi="Wingdings" w:hint="default"/>
+        <w:sz w:val="20"/>
+      </w:rPr>
+    </w:lvl>
+    <w:lvl w:ilvl="5" w:tentative="1">
+      <w:start w:val="1"/>
+      <w:numFmt w:val="bullet"/>
+      <w:lvlText w:val=""/>
+      <w:lvlJc w:val="left"/>
+      <w:pPr>
+        <w:tabs>
+          <w:tab w:val="num" w:pos="4320"/>
+        </w:tabs>
+        <w:ind w:left="4320" w:hanging="360"/>
+      </w:pPr>
+      <w:rPr>
+        <w:rFonts w:ascii="Wingdings" w:hAnsi="Wingdings" w:hint="default"/>
+        <w:sz w:val="20"/>
+      </w:rPr>
+    </w:lvl>
+    <w:lvl w:ilvl="6" w:tentative="1">
+      <w:start w:val="1"/>
+      <w:numFmt w:val="bullet"/>
+      <w:lvlText w:val=""/>
+      <w:lvlJc w:val="left"/>
+      <w:pPr>
+        <w:tabs>
+          <w:tab w:val="num" w:pos="5040"/>
+        </w:tabs>
+        <w:ind w:left="5040" w:hanging="360"/>
+      </w:pPr>
+      <w:rPr>
+        <w:rFonts w:ascii="Wingdings" w:hAnsi="Wingdings" w:hint="default"/>
+        <w:sz w:val="20"/>
+      </w:rPr>
+    </w:lvl>
+    <w:lvl w:ilvl="7" w:tentative="1">
+      <w:start w:val="1"/>
+      <w:numFmt w:val="bullet"/>
+      <w:lvlText w:val=""/>
+      <w:lvlJc w:val="left"/>
+      <w:pPr>
+        <w:tabs>
+          <w:tab w:val="num" w:pos="5760"/>
+        </w:tabs>
+        <w:ind w:left="5760" w:hanging="360"/>
+      </w:pPr>
+      <w:rPr>
+        <w:rFonts w:ascii="Wingdings" w:hAnsi="Wingdings" w:hint="default"/>
+        <w:sz w:val="20"/>
+      </w:rPr>
+    </w:lvl>
+    <w:lvl w:ilvl="8" w:tentative="1">
+      <w:start w:val="1"/>
+      <w:numFmt w:val="bullet"/>
+      <w:lvlText w:val=""/>
+      <w:lvlJc w:val="left"/>
+      <w:pPr>
+        <w:tabs>
+          <w:tab w:val="num" w:pos="6480"/>
+        </w:tabs>
+        <w:ind w:left="6480" w:hanging="360"/>
+      </w:pPr>
+      <w:rPr>
+        <w:rFonts w:ascii="Wingdings" w:hAnsi="Wingdings" w:hint="default"/>
+        <w:sz w:val="20"/>
+      </w:rPr>
+    </w:lvl>
+  </w:abstractNum>
+  <w:num w:numId="1">
+    <w:abstractNumId w:val="4"/>
+  </w:num>
+  <w:num w:numId="2">
+    <w:abstractNumId w:val="3"/>
+  </w:num>
+  <w:num w:numId="3">
+    <w:abstractNumId w:val="2"/>
+  </w:num>
+  <w:num w:numId="4">
+    <w:abstractNumId w:val="0"/>
+  </w:num>
+  <w:num w:numId="5">
+    <w:abstractNumId w:val="1"/>
+  </w:num>
+</w:numbering>
 </file>
 
 <file path=word/styles.xml><?xml version="1.0" encoding="utf-8"?>
@@ -789,7 +2299,6 @@
   <w:style w:type="character" w:default="1" w:styleId="Fuentedeprrafopredeter">
     <w:name w:val="Default Paragraph Font"/>
     <w:uiPriority w:val="1"/>
-    <w:semiHidden/>
     <w:unhideWhenUsed/>
   </w:style>
   <w:style w:type="table" w:default="1" w:styleId="Tablanormal">
@@ -831,6 +2340,61 @@
         <w:insideV w:val="single" w:sz="4" w:space="0" w:color="auto"/>
       </w:tblBorders>
     </w:tblPr>
+  </w:style>
+  <w:style w:type="paragraph" w:styleId="Encabezado">
+    <w:name w:val="header"/>
+    <w:basedOn w:val="Normal"/>
+    <w:link w:val="EncabezadoCar"/>
+    <w:uiPriority w:val="99"/>
+    <w:unhideWhenUsed/>
+    <w:rsid w:val="00797E21"/>
+    <w:pPr>
+      <w:tabs>
+        <w:tab w:val="center" w:pos="4680"/>
+        <w:tab w:val="right" w:pos="9360"/>
+      </w:tabs>
+      <w:spacing w:after="0" w:line="240" w:lineRule="auto"/>
+    </w:pPr>
+  </w:style>
+  <w:style w:type="character" w:customStyle="1" w:styleId="EncabezadoCar">
+    <w:name w:val="Encabezado Car"/>
+    <w:basedOn w:val="Fuentedeprrafopredeter"/>
+    <w:link w:val="Encabezado"/>
+    <w:uiPriority w:val="99"/>
+    <w:rsid w:val="00797E21"/>
+  </w:style>
+  <w:style w:type="paragraph" w:styleId="Piedepgina">
+    <w:name w:val="footer"/>
+    <w:basedOn w:val="Normal"/>
+    <w:link w:val="PiedepginaCar"/>
+    <w:uiPriority w:val="99"/>
+    <w:unhideWhenUsed/>
+    <w:rsid w:val="00797E21"/>
+    <w:pPr>
+      <w:tabs>
+        <w:tab w:val="center" w:pos="4680"/>
+        <w:tab w:val="right" w:pos="9360"/>
+      </w:tabs>
+      <w:spacing w:after="0" w:line="240" w:lineRule="auto"/>
+    </w:pPr>
+  </w:style>
+  <w:style w:type="character" w:customStyle="1" w:styleId="PiedepginaCar">
+    <w:name w:val="Pie de página Car"/>
+    <w:basedOn w:val="Fuentedeprrafopredeter"/>
+    <w:link w:val="Piedepgina"/>
+    <w:uiPriority w:val="99"/>
+    <w:rsid w:val="00797E21"/>
+  </w:style>
+  <w:style w:type="paragraph" w:styleId="Prrafodelista">
+    <w:name w:val="List Paragraph"/>
+    <w:basedOn w:val="Normal"/>
+    <w:uiPriority w:val="34"/>
+    <w:qFormat/>
+    <w:rsid w:val="00CA3202"/>
+    <w:pPr>
+      <w:ind w:left="720"/>
+      <w:contextualSpacing/>
+    </w:pPr>
   </w:style>
 </w:styles>
 </file>

</xml_diff>

<commit_message>
Added cambios en hallazgos e informe preliminar
</commit_message>
<xml_diff>
--- a/SILAIS - Auditoria/AVANCES_PROYECTO_FINAL/HALLAZGOS.docx
+++ b/SILAIS - Auditoria/AVANCES_PROYECTO_FINAL/HALLAZGOS.docx
@@ -4813,20 +4813,48 @@
               <w:rPr>
                 <w:rFonts w:ascii="Arial" w:hAnsi="Arial" w:cs="Arial"/>
               </w:rPr>
-              <w:t xml:space="preserve">Mediante la utilización del Analizador de Redes por Hardware </w:t>
+              <w:t>Mediante la evaluación técnica utilizando comandos de diagnóstico del sistema operativo (</w:t>
             </w:r>
             <w:proofErr w:type="spellStart"/>
             <w:r>
               <w:rPr>
                 <w:rFonts w:ascii="Arial" w:hAnsi="Arial" w:cs="Arial"/>
               </w:rPr>
-              <w:t>NetAlly</w:t>
+              <w:t>ipconfig</w:t>
             </w:r>
             <w:proofErr w:type="spellEnd"/>
             <w:r>
               <w:rPr>
                 <w:rFonts w:ascii="Arial" w:hAnsi="Arial" w:cs="Arial"/>
               </w:rPr>
+              <w:t xml:space="preserve">) y pruebas de rendimiento de </w:t>
+            </w:r>
+            <w:proofErr w:type="spellStart"/>
+            <w:r>
+              <w:rPr>
+                <w:rFonts w:ascii="Arial" w:hAnsi="Arial" w:cs="Arial"/>
+              </w:rPr>
+              <w:t>Throughput</w:t>
+            </w:r>
+            <w:proofErr w:type="spellEnd"/>
+            <w:r>
+              <w:rPr>
+                <w:rFonts w:ascii="Arial" w:hAnsi="Arial" w:cs="Arial"/>
+              </w:rPr>
+              <w:t xml:space="preserve"> con la herramienta de software iPerf3, se verificó que la velocidad de negociación de todos los enlaces de la red LAN está estancada en 100 Mbps. Esta limitación técnica está impuesta directamente por la obsolescencia de los </w:t>
+            </w:r>
+            <w:proofErr w:type="spellStart"/>
+            <w:r>
+              <w:rPr>
+                <w:rFonts w:ascii="Arial" w:hAnsi="Arial" w:cs="Arial"/>
+              </w:rPr>
+              <w:t>Switches</w:t>
+            </w:r>
+            <w:proofErr w:type="spellEnd"/>
+            <w:r>
+              <w:rPr>
+                <w:rFonts w:ascii="Arial" w:hAnsi="Arial" w:cs="Arial"/>
+              </w:rPr>
               <w:t xml:space="preserve"> </w:t>
             </w:r>
             <w:proofErr w:type="spellStart"/>
@@ -4834,56 +4862,14 @@
               <w:rPr>
                 <w:rFonts w:ascii="Arial" w:hAnsi="Arial" w:cs="Arial"/>
               </w:rPr>
-              <w:t>EtherScope</w:t>
+              <w:t>Fast</w:t>
             </w:r>
             <w:proofErr w:type="spellEnd"/>
             <w:r>
               <w:rPr>
                 <w:rFonts w:ascii="Arial" w:hAnsi="Arial" w:cs="Arial"/>
               </w:rPr>
-              <w:t xml:space="preserve"> </w:t>
-            </w:r>
-            <w:proofErr w:type="spellStart"/>
-            <w:r>
-              <w:rPr>
-                <w:rFonts w:ascii="Arial" w:hAnsi="Arial" w:cs="Arial"/>
-              </w:rPr>
-              <w:t>nXG</w:t>
-            </w:r>
-            <w:proofErr w:type="spellEnd"/>
-            <w:r>
-              <w:rPr>
-                <w:rFonts w:ascii="Arial" w:hAnsi="Arial" w:cs="Arial"/>
-              </w:rPr>
-              <w:t xml:space="preserve">, se verificó que la velocidad de negociación de todos los enlaces de la red LAN es de 100 Mbps. Esta limitación es impuesta por los </w:t>
-            </w:r>
-            <w:proofErr w:type="spellStart"/>
-            <w:r>
-              <w:rPr>
-                <w:rFonts w:ascii="Arial" w:hAnsi="Arial" w:cs="Arial"/>
-              </w:rPr>
-              <w:t>switches</w:t>
-            </w:r>
-            <w:proofErr w:type="spellEnd"/>
-            <w:r>
-              <w:rPr>
-                <w:rFonts w:ascii="Arial" w:hAnsi="Arial" w:cs="Arial"/>
-              </w:rPr>
-              <w:t xml:space="preserve"> </w:t>
-            </w:r>
-            <w:proofErr w:type="spellStart"/>
-            <w:r>
-              <w:rPr>
-                <w:rFonts w:ascii="Arial" w:hAnsi="Arial" w:cs="Arial"/>
-              </w:rPr>
-              <w:t>Fast</w:t>
-            </w:r>
-            <w:proofErr w:type="spellEnd"/>
-            <w:r>
-              <w:rPr>
-                <w:rFonts w:ascii="Arial" w:hAnsi="Arial" w:cs="Arial"/>
-              </w:rPr>
-              <w:t xml:space="preserve"> Ethernet no administrables, los cuales son la causa del estrangulamiento operativo. Las estaciones de trabajo, equipadas con tarjetas de red Gigabit, operan a un 10% de su capacidad, lo que restringe el rendimiento de las aplicaciones críticas, incluyendo la transmisión de datos del SISNIVEN al MINSA Central.</w:t>
+              <w:t xml:space="preserve"> Ethernet no administrables que fungen como núcleo de la red, los cuales generan un estrangulamiento operativo crónico. Como resultado, las estaciones de trabajo modernas del SILAIS, que están equipadas con tarjetas de red Gigabit (1000 Mbps), están operando apenas a un 10% de su capacidad física, restringiendo severamente el rendimiento de aplicaciones críticas y ralentizando la transmisión de datos epidemiológicos del SISNIVEN hacia el MINSA Central.</w:t>
             </w:r>
           </w:p>
         </w:tc>
@@ -5055,49 +5041,13 @@
               <w:rPr>
                 <w:rFonts w:ascii="Arial" w:hAnsi="Arial" w:cs="Arial"/>
               </w:rPr>
-              <w:t xml:space="preserve">Reporte de pruebas de velocidad de enlace generado por el Analizador </w:t>
-            </w:r>
-            <w:proofErr w:type="spellStart"/>
-            <w:r>
-              <w:rPr>
-                <w:rFonts w:ascii="Arial" w:hAnsi="Arial" w:cs="Arial"/>
-              </w:rPr>
-              <w:t>NetAlly</w:t>
-            </w:r>
-            <w:proofErr w:type="spellEnd"/>
-            <w:r>
-              <w:rPr>
-                <w:rFonts w:ascii="Arial" w:hAnsi="Arial" w:cs="Arial"/>
-              </w:rPr>
-              <w:t xml:space="preserve"> </w:t>
-            </w:r>
-            <w:proofErr w:type="spellStart"/>
-            <w:r>
-              <w:rPr>
-                <w:rFonts w:ascii="Arial" w:hAnsi="Arial" w:cs="Arial"/>
-              </w:rPr>
-              <w:t>EtherScope</w:t>
-            </w:r>
-            <w:proofErr w:type="spellEnd"/>
-            <w:r>
-              <w:rPr>
-                <w:rFonts w:ascii="Arial" w:hAnsi="Arial" w:cs="Arial"/>
-              </w:rPr>
-              <w:t xml:space="preserve"> </w:t>
-            </w:r>
-            <w:proofErr w:type="spellStart"/>
-            <w:r>
-              <w:rPr>
-                <w:rFonts w:ascii="Arial" w:hAnsi="Arial" w:cs="Arial"/>
-              </w:rPr>
-              <w:t>nXG</w:t>
-            </w:r>
-            <w:proofErr w:type="spellEnd"/>
-            <w:r>
-              <w:rPr>
-                <w:rFonts w:ascii="Arial" w:hAnsi="Arial" w:cs="Arial"/>
-              </w:rPr>
-              <w:t>, confirmando la negociación a 100 Mbps en todos los puertos.</w:t>
+              <w:t>Verificación</w:t>
+            </w:r>
+            <w:r>
+              <w:rPr>
+                <w:rFonts w:ascii="Arial" w:hAnsi="Arial" w:cs="Arial"/>
+              </w:rPr>
+              <w:t xml:space="preserve"> del adaptador de red en las estaciones de trabajo de áreas críticas, confirmando la negociación forzada a 100 Mbps.</w:t>
             </w:r>
           </w:p>
           <w:p>
@@ -5114,35 +5064,21 @@
               <w:rPr>
                 <w:rFonts w:ascii="Arial" w:hAnsi="Arial" w:cs="Arial"/>
               </w:rPr>
-              <w:t xml:space="preserve">Fichas técnicas de los </w:t>
+              <w:t>Registros (</w:t>
             </w:r>
             <w:proofErr w:type="spellStart"/>
             <w:r>
               <w:rPr>
                 <w:rFonts w:ascii="Arial" w:hAnsi="Arial" w:cs="Arial"/>
               </w:rPr>
-              <w:t>switches</w:t>
+              <w:t>logs</w:t>
             </w:r>
             <w:proofErr w:type="spellEnd"/>
             <w:r>
               <w:rPr>
                 <w:rFonts w:ascii="Arial" w:hAnsi="Arial" w:cs="Arial"/>
               </w:rPr>
-              <w:t xml:space="preserve"> que indican una velocidad máxima de </w:t>
-            </w:r>
-            <w:proofErr w:type="spellStart"/>
-            <w:r>
-              <w:rPr>
-                <w:rFonts w:ascii="Arial" w:hAnsi="Arial" w:cs="Arial"/>
-              </w:rPr>
-              <w:t>Fast</w:t>
-            </w:r>
-            <w:proofErr w:type="spellEnd"/>
-            <w:r>
-              <w:rPr>
-                <w:rFonts w:ascii="Arial" w:hAnsi="Arial" w:cs="Arial"/>
-              </w:rPr>
-              <w:t xml:space="preserve"> Ethernet.</w:t>
+              <w:t>) de las pruebas de rendimiento de ancho de banda local realizadas con iPerf3 entre estaciones de trabajo.</w:t>
             </w:r>
           </w:p>
           <w:p>
@@ -5159,7 +5095,40 @@
               <w:rPr>
                 <w:rFonts w:ascii="Arial" w:hAnsi="Arial" w:cs="Arial"/>
               </w:rPr>
-              <w:t>Entrevistas con usuarios de áreas críticas que reportan lentitud en aplicaciones.</w:t>
+              <w:t xml:space="preserve">Inspección visual y documentación de las fichas técnicas de los </w:t>
+            </w:r>
+            <w:proofErr w:type="spellStart"/>
+            <w:r>
+              <w:rPr>
+                <w:rFonts w:ascii="Arial" w:hAnsi="Arial" w:cs="Arial"/>
+              </w:rPr>
+              <w:t>switches</w:t>
+            </w:r>
+            <w:proofErr w:type="spellEnd"/>
+            <w:r>
+              <w:rPr>
+                <w:rFonts w:ascii="Arial" w:hAnsi="Arial" w:cs="Arial"/>
+              </w:rPr>
+              <w:t xml:space="preserve"> actuales, confirmando que sus puertos físicos no soportan el estándar Gigabit.</w:t>
+            </w:r>
+          </w:p>
+          <w:p>
+            <w:pPr>
+              <w:numPr>
+                <w:ilvl w:val="0"/>
+                <w:numId w:val="2"/>
+              </w:numPr>
+              <w:rPr>
+                <w:rFonts w:ascii="Arial" w:hAnsi="Arial" w:cs="Arial"/>
+              </w:rPr>
+            </w:pPr>
+            <w:bookmarkStart w:id="0" w:name="_GoBack"/>
+            <w:bookmarkEnd w:id="0"/>
+            <w:r>
+              <w:rPr>
+                <w:rFonts w:ascii="Arial" w:hAnsi="Arial" w:cs="Arial"/>
+              </w:rPr>
+              <w:t>Entrevistas documentadas con los usuarios de áreas críticas (Estadística, Epidemiología) que reportan caídas de conexión y lentitud severa durante el envío de reportes al SISNIVEN.</w:t>
             </w:r>
           </w:p>
         </w:tc>
@@ -5719,7 +5688,14 @@
               <w:rPr>
                 <w:rFonts w:ascii="Arial" w:hAnsi="Arial" w:cs="Arial"/>
               </w:rPr>
-              <w:t xml:space="preserve"> Gigabit administrables para eliminar el cuello de botella.</w:t>
+              <w:t xml:space="preserve"> Gigabit administrables </w:t>
+            </w:r>
+            <w:r>
+              <w:rPr>
+                <w:rFonts w:ascii="Arial" w:hAnsi="Arial" w:cs="Arial"/>
+              </w:rPr>
+              <w:lastRenderedPageBreak/>
+              <w:t>para eliminar el cuello de botella.</w:t>
             </w:r>
           </w:p>
           <w:p>
@@ -5774,7 +5750,6 @@
           <w:b/>
           <w:bCs/>
         </w:rPr>
-        <w:lastRenderedPageBreak/>
         <w:t>HALLAZGO No. H-RED-INFRA-04</w:t>
       </w:r>
     </w:p>
@@ -6260,63 +6235,63 @@
               <w:rPr>
                 <w:rFonts w:ascii="Arial" w:hAnsi="Arial" w:cs="Arial"/>
               </w:rPr>
-              <w:t xml:space="preserve">La monitorización ambiental realizada con sensores dedicados </w:t>
+              <w:t xml:space="preserve">La monitorización ambiental realizada en el área donde convergen los equipos centrales de conmutación de la Sede del SILAIS Masaya, reveló condiciones operativas de alto riesgo. Las mediciones efectuadas con un </w:t>
             </w:r>
             <w:proofErr w:type="spellStart"/>
             <w:r>
               <w:rPr>
                 <w:rFonts w:ascii="Arial" w:hAnsi="Arial" w:cs="Arial"/>
               </w:rPr>
-              <w:t>NetBotz</w:t>
+              <w:t>termohigrómetro</w:t>
             </w:r>
             <w:proofErr w:type="spellEnd"/>
             <w:r>
               <w:rPr>
                 <w:rFonts w:ascii="Arial" w:hAnsi="Arial" w:cs="Arial"/>
               </w:rPr>
-              <w:t xml:space="preserve"> durante un período de 48 horas reveló condiciones adversas en las áreas de comunicaciones. Se registraron temperaturas </w:t>
-            </w:r>
-            <w:proofErr w:type="gramStart"/>
-            <w:r>
-              <w:rPr>
-                <w:rFonts w:ascii="Arial" w:hAnsi="Arial" w:cs="Arial"/>
-              </w:rPr>
-              <w:t>pico superiores a los 34°C</w:t>
-            </w:r>
-            <w:proofErr w:type="gramEnd"/>
-            <w:r>
-              <w:rPr>
-                <w:rFonts w:ascii="Arial" w:hAnsi="Arial" w:cs="Arial"/>
-              </w:rPr>
-              <w:t xml:space="preserve"> y niveles de humedad relativa que alcanzaron el 88%, excediendo los rangos operativos recomendados para los equipos de red. Adicionalmente, la medición de calidad de energía con el analizador </w:t>
+              <w:t xml:space="preserve"> digital portátil registraron temperaturas sostenidas superiores a los 32°C y niveles de humedad perjudiciales para los equipos de red. Adicionalmente, la inspección física evidenció que los </w:t>
             </w:r>
             <w:proofErr w:type="spellStart"/>
             <w:r>
               <w:rPr>
                 <w:rFonts w:ascii="Arial" w:hAnsi="Arial" w:cs="Arial"/>
               </w:rPr>
-              <w:t>Fluke</w:t>
+              <w:t>Switches</w:t>
             </w:r>
             <w:proofErr w:type="spellEnd"/>
             <w:r>
               <w:rPr>
                 <w:rFonts w:ascii="Arial" w:hAnsi="Arial" w:cs="Arial"/>
               </w:rPr>
-              <w:t xml:space="preserve"> 430 Series II mostró la presencia de armónicos y fluctuaciones de voltaje que exceden los límites seguros, representando un riesgo para las fuentes de poder de los </w:t>
+              <w:t xml:space="preserve"> </w:t>
             </w:r>
             <w:proofErr w:type="spellStart"/>
             <w:r>
               <w:rPr>
                 <w:rFonts w:ascii="Arial" w:hAnsi="Arial" w:cs="Arial"/>
               </w:rPr>
-              <w:t>switches</w:t>
+              <w:t>Fast</w:t>
             </w:r>
             <w:proofErr w:type="spellEnd"/>
             <w:r>
               <w:rPr>
                 <w:rFonts w:ascii="Arial" w:hAnsi="Arial" w:cs="Arial"/>
               </w:rPr>
-              <w:t xml:space="preserve"> y las UPS.</w:t>
+              <w:t xml:space="preserve"> Ethernet y el </w:t>
+            </w:r>
+            <w:proofErr w:type="spellStart"/>
+            <w:r>
+              <w:rPr>
+                <w:rFonts w:ascii="Arial" w:hAnsi="Arial" w:cs="Arial"/>
+              </w:rPr>
+              <w:t>Router</w:t>
+            </w:r>
+            <w:proofErr w:type="spellEnd"/>
+            <w:r>
+              <w:rPr>
+                <w:rFonts w:ascii="Arial" w:hAnsi="Arial" w:cs="Arial"/>
+              </w:rPr>
+              <w:t xml:space="preserve"> principal carecen de un sistema de acondicionamiento de energía de grado industrial, estando expuestos a las constantes fluctuaciones eléctricas de la zona, lo cual pone en riesgo crítico la conectividad de los sistemas de reporte epidemiológico (SISNIVEN) y la gestión de insumos médicos.</w:t>
             </w:r>
           </w:p>
         </w:tc>
@@ -6448,6 +6423,13 @@
           </w:tcPr>
           <w:p>
             <w:pPr>
+              <w:rPr>
+                <w:rFonts w:ascii="Arial" w:hAnsi="Arial" w:cs="Arial"/>
+              </w:rPr>
+            </w:pPr>
+          </w:p>
+          <w:p>
+            <w:pPr>
               <w:numPr>
                 <w:ilvl w:val="0"/>
                 <w:numId w:val="2"/>
@@ -6460,21 +6442,13 @@
               <w:rPr>
                 <w:rFonts w:ascii="Arial" w:hAnsi="Arial" w:cs="Arial"/>
               </w:rPr>
-              <w:t xml:space="preserve">Reporte de tendencias de temperatura y humedad generado por los sensores </w:t>
-            </w:r>
-            <w:proofErr w:type="spellStart"/>
-            <w:r>
-              <w:rPr>
-                <w:rFonts w:ascii="Arial" w:hAnsi="Arial" w:cs="Arial"/>
-              </w:rPr>
-              <w:t>NetBotz</w:t>
-            </w:r>
-            <w:proofErr w:type="spellEnd"/>
-            <w:r>
-              <w:rPr>
-                <w:rFonts w:ascii="Arial" w:hAnsi="Arial" w:cs="Arial"/>
-              </w:rPr>
-              <w:t>, mostrando las excursiones fuera de los rangos aceptables.</w:t>
+              <w:t>Reporte de registro de temperatura y humedad ambiental fuera de los umbrales recomendados por los fabr</w:t>
+            </w:r>
+            <w:r>
+              <w:rPr>
+                <w:rFonts w:ascii="Arial" w:hAnsi="Arial" w:cs="Arial"/>
+              </w:rPr>
+              <w:t>icantes de los equipos de red.</w:t>
             </w:r>
           </w:p>
           <w:p>
@@ -6491,21 +6465,27 @@
               <w:rPr>
                 <w:rFonts w:ascii="Arial" w:hAnsi="Arial" w:cs="Arial"/>
               </w:rPr>
-              <w:t xml:space="preserve">Mediciones del Analizador de Calidad de Energía </w:t>
+              <w:t xml:space="preserve">Registro fotográfico de la ubicación actual de los </w:t>
             </w:r>
             <w:proofErr w:type="spellStart"/>
             <w:r>
               <w:rPr>
                 <w:rFonts w:ascii="Arial" w:hAnsi="Arial" w:cs="Arial"/>
               </w:rPr>
-              <w:t>Fluke</w:t>
+              <w:t>Switches</w:t>
             </w:r>
             <w:proofErr w:type="spellEnd"/>
             <w:r>
               <w:rPr>
                 <w:rFonts w:ascii="Arial" w:hAnsi="Arial" w:cs="Arial"/>
               </w:rPr>
-              <w:t xml:space="preserve"> 430 Series II que documentan los armónicos y fluctuaciones de voltaje.</w:t>
+              <w:t>, evidenciando la falta de climat</w:t>
+            </w:r>
+            <w:r>
+              <w:rPr>
+                <w:rFonts w:ascii="Arial" w:hAnsi="Arial" w:cs="Arial"/>
+              </w:rPr>
+              <w:t>ización y ventilación cruzada.</w:t>
             </w:r>
           </w:p>
           <w:p>
@@ -6522,21 +6502,7 @@
               <w:rPr>
                 <w:rFonts w:ascii="Arial" w:hAnsi="Arial" w:cs="Arial"/>
               </w:rPr>
-              <w:t xml:space="preserve">Fotografías de las áreas de </w:t>
-            </w:r>
-            <w:proofErr w:type="spellStart"/>
-            <w:r>
-              <w:rPr>
-                <w:rFonts w:ascii="Arial" w:hAnsi="Arial" w:cs="Arial"/>
-              </w:rPr>
-              <w:t>switches</w:t>
-            </w:r>
-            <w:proofErr w:type="spellEnd"/>
-            <w:r>
-              <w:rPr>
-                <w:rFonts w:ascii="Arial" w:hAnsi="Arial" w:cs="Arial"/>
-              </w:rPr>
-              <w:t xml:space="preserve"> evidenciando la falta de climatización.</w:t>
+              <w:t>Inspección visual de la ausencia de reguladores de voltaje o UPS con capacidad suficiente para soportar el núcleo de red durante cortes eléctricos prolongados."</w:t>
             </w:r>
           </w:p>
         </w:tc>
@@ -6843,7 +6809,18 @@
                       <w:lang w:eastAsia="es-US"/>
                       <w14:ligatures w14:val="none"/>
                     </w:rPr>
-                    <w:t>Nivel de Riesgo</w:t>
+                    <w:t xml:space="preserve">Nivel </w:t>
+                  </w:r>
+                  <w:r>
+                    <w:rPr>
+                      <w:rFonts w:ascii="Arial" w:eastAsia="Times New Roman" w:hAnsi="Arial" w:cs="Arial"/>
+                      <w:color w:val="000000"/>
+                      <w:kern w:val="0"/>
+                      <w:lang w:eastAsia="es-US"/>
+                      <w14:ligatures w14:val="none"/>
+                    </w:rPr>
+                    <w:lastRenderedPageBreak/>
+                    <w:t>de Riesgo</w:t>
                   </w:r>
                 </w:p>
               </w:tc>
@@ -6885,6 +6862,7 @@
                       <w:lang w:eastAsia="es-US"/>
                       <w14:ligatures w14:val="none"/>
                     </w:rPr>
+                    <w:lastRenderedPageBreak/>
                     <w:t xml:space="preserve">R-RED-008: Fallo prematuro de </w:t>
                   </w:r>
                   <w:proofErr w:type="spellStart"/>
@@ -7060,6 +7038,7 @@
               <w:rPr>
                 <w:rFonts w:ascii="Arial" w:hAnsi="Arial" w:cs="Arial"/>
               </w:rPr>
+              <w:lastRenderedPageBreak/>
               <w:t>RECOMENDACIONES</w:t>
             </w:r>
           </w:p>
@@ -8040,6 +8019,7 @@
               <w:rPr>
                 <w:rFonts w:ascii="Arial" w:hAnsi="Arial" w:cs="Arial"/>
               </w:rPr>
+              <w:lastRenderedPageBreak/>
               <w:t>Incumplimiento de la Ley 921 de Protección de Datos Personales.</w:t>
             </w:r>
           </w:p>
@@ -8066,6 +8046,7 @@
               <w:rPr>
                 <w:rFonts w:ascii="Arial" w:hAnsi="Arial" w:cs="Arial"/>
               </w:rPr>
+              <w:lastRenderedPageBreak/>
               <w:t>VALORACIÓN DEL RIESGO</w:t>
             </w:r>
           </w:p>
@@ -9418,6 +9399,7 @@
               <w:rPr>
                 <w:rFonts w:ascii="Arial" w:hAnsi="Arial" w:cs="Arial"/>
               </w:rPr>
+              <w:lastRenderedPageBreak/>
               <w:t>VALORACIÓN DEL RIESGO</w:t>
             </w:r>
           </w:p>
@@ -10915,7 +10897,18 @@
                       <w:lang w:eastAsia="es-US"/>
                       <w14:ligatures w14:val="none"/>
                     </w:rPr>
-                    <w:t>Nivel de Riesgo</w:t>
+                    <w:t xml:space="preserve">Nivel de </w:t>
+                  </w:r>
+                  <w:r>
+                    <w:rPr>
+                      <w:rFonts w:ascii="Arial" w:eastAsia="Times New Roman" w:hAnsi="Arial" w:cs="Arial"/>
+                      <w:color w:val="000000"/>
+                      <w:kern w:val="0"/>
+                      <w:lang w:eastAsia="es-US"/>
+                      <w14:ligatures w14:val="none"/>
+                    </w:rPr>
+                    <w:lastRenderedPageBreak/>
+                    <w:t>Riesgo</w:t>
                   </w:r>
                 </w:p>
               </w:tc>
@@ -10957,6 +10950,7 @@
                       <w:lang w:eastAsia="es-US"/>
                       <w14:ligatures w14:val="none"/>
                     </w:rPr>
+                    <w:lastRenderedPageBreak/>
                     <w:t xml:space="preserve">R-RED-004: Interceptación de credenciales y datos vía </w:t>
                   </w:r>
                   <w:proofErr w:type="spellStart"/>
@@ -11297,6 +11291,7 @@
               <w:rPr>
                 <w:rFonts w:ascii="Arial" w:hAnsi="Arial" w:cs="Arial"/>
               </w:rPr>
+              <w:lastRenderedPageBreak/>
               <w:t>RECOMENDACIONES</w:t>
             </w:r>
           </w:p>
@@ -12246,6 +12241,7 @@
                       <w:lang w:eastAsia="es-US"/>
                       <w14:ligatures w14:val="none"/>
                     </w:rPr>
+                    <w:lastRenderedPageBreak/>
                     <w:t>Riesgo Asociado</w:t>
                   </w:r>
                 </w:p>
@@ -13508,6 +13504,7 @@
                       <w:lang w:eastAsia="es-US"/>
                       <w14:ligatures w14:val="none"/>
                     </w:rPr>
+                    <w:lastRenderedPageBreak/>
                     <w:t>Riesgo Asociado</w:t>
                   </w:r>
                 </w:p>
@@ -13931,7 +13928,6 @@
           <w:b/>
           <w:bCs/>
         </w:rPr>
-        <w:lastRenderedPageBreak/>
         <w:t>HALLAZGO No. H-RED-GOB-0</w:t>
       </w:r>
       <w:r>
@@ -14938,7 +14934,18 @@
                       <w:lang w:eastAsia="es-US"/>
                       <w14:ligatures w14:val="none"/>
                     </w:rPr>
-                    <w:t>Nivel de Riesgo</w:t>
+                    <w:t xml:space="preserve">Nivel de </w:t>
+                  </w:r>
+                  <w:r>
+                    <w:rPr>
+                      <w:rFonts w:ascii="Arial" w:eastAsia="Times New Roman" w:hAnsi="Arial" w:cs="Arial"/>
+                      <w:color w:val="000000"/>
+                      <w:kern w:val="0"/>
+                      <w:lang w:eastAsia="es-US"/>
+                      <w14:ligatures w14:val="none"/>
+                    </w:rPr>
+                    <w:lastRenderedPageBreak/>
+                    <w:t>Riesgo</w:t>
                   </w:r>
                 </w:p>
               </w:tc>
@@ -14980,6 +14987,7 @@
                       <w:lang w:eastAsia="es-US"/>
                       <w14:ligatures w14:val="none"/>
                     </w:rPr>
+                    <w:lastRenderedPageBreak/>
                     <w:t xml:space="preserve">Proceso DSS03 no implementado: </w:t>
                   </w:r>
                   <w:proofErr w:type="spellStart"/>
@@ -15155,6 +15163,7 @@
               <w:rPr>
                 <w:rFonts w:ascii="Arial" w:hAnsi="Arial" w:cs="Arial"/>
               </w:rPr>
+              <w:lastRenderedPageBreak/>
               <w:t>RECOMENDACIONES</w:t>
             </w:r>
           </w:p>
@@ -15267,7 +15276,6 @@
           <w:b/>
           <w:bCs/>
         </w:rPr>
-        <w:lastRenderedPageBreak/>
         <w:t>HALLAZGO No. H-RED-GOB-0</w:t>
       </w:r>
       <w:r>
@@ -15390,8 +15398,6 @@
               </w:rPr>
               <w:t>H11</w:t>
             </w:r>
-            <w:bookmarkStart w:id="0" w:name="_GoBack"/>
-            <w:bookmarkEnd w:id="0"/>
           </w:p>
         </w:tc>
       </w:tr>
@@ -16272,7 +16278,18 @@
                       <w:lang w:eastAsia="es-US"/>
                       <w14:ligatures w14:val="none"/>
                     </w:rPr>
-                    <w:t>Nivel de Riesgo</w:t>
+                    <w:t xml:space="preserve">Nivel de </w:t>
+                  </w:r>
+                  <w:r>
+                    <w:rPr>
+                      <w:rFonts w:ascii="Arial" w:eastAsia="Times New Roman" w:hAnsi="Arial" w:cs="Arial"/>
+                      <w:color w:val="000000"/>
+                      <w:kern w:val="0"/>
+                      <w:lang w:eastAsia="es-US"/>
+                      <w14:ligatures w14:val="none"/>
+                    </w:rPr>
+                    <w:lastRenderedPageBreak/>
+                    <w:t>Riesgo</w:t>
                   </w:r>
                 </w:p>
               </w:tc>
@@ -16314,6 +16331,7 @@
                       <w:lang w:eastAsia="es-US"/>
                       <w14:ligatures w14:val="none"/>
                     </w:rPr>
+                    <w:lastRenderedPageBreak/>
                     <w:t>Riesgo Global: Todos los riesgos identificados, al no ser gestionados formalmente, tienen una mayor probabilidad de materializarse</w:t>
                   </w:r>
                 </w:p>
@@ -16467,6 +16485,7 @@
               <w:rPr>
                 <w:rFonts w:ascii="Arial" w:hAnsi="Arial" w:cs="Arial"/>
               </w:rPr>
+              <w:lastRenderedPageBreak/>
               <w:t>RECOMENDACIONES</w:t>
             </w:r>
           </w:p>
@@ -20253,7 +20272,7 @@
   <a:extraClrSchemeLst/>
   <a:extLst>
     <a:ext uri="{05A4C25C-085E-4340-85A3-A5531E510DB2}">
-      <thm15:themeFamily xmlns:thm15="http://schemas.microsoft.com/office/thememl/2012/main" xmlns="" name="Office Theme" id="{62F939B6-93AF-4DB8-9C6B-D6C7DFDC589F}" vid="{4A3C46E8-61CC-4603-A589-7422A47A8E4A}"/>
+      <thm15:themeFamily xmlns="" xmlns:thm15="http://schemas.microsoft.com/office/thememl/2012/main" name="Office Theme" id="{62F939B6-93AF-4DB8-9C6B-D6C7DFDC589F}" vid="{4A3C46E8-61CC-4603-A589-7422A47A8E4A}"/>
     </a:ext>
   </a:extLst>
 </a:theme>

</xml_diff>

<commit_message>
Se agregaron evidencias nuevas, tabla de Riesgos, vulnerabilidades y amenazas
</commit_message>
<xml_diff>
--- a/SILAIS - Auditoria/AVANCES_PROYECTO_FINAL/HALLAZGOS.docx
+++ b/SILAIS - Auditoria/AVANCES_PROYECTO_FINAL/HALLAZGOS.docx
@@ -1090,10 +1090,6 @@
           </mc:Choice>
           <mc:Fallback>
             <w:pict>
-              <v:shapetype id="_x0000_t202" coordsize="21600,21600" o:spt="202" path="m,l,21600r21600,l21600,xe">
-                <v:stroke joinstyle="miter"/>
-                <v:path gradientshapeok="t" o:connecttype="rect"/>
-              </v:shapetype>
               <v:shape id="Text Box 2" o:spid="_x0000_s1028" type="#_x0000_t202" style="position:absolute;margin-left:163.5pt;margin-top:.55pt;width:130.5pt;height:153pt;z-index:251660288;visibility:visible;mso-wrap-style:square;mso-width-percent:0;mso-height-percent:0;mso-wrap-distance-left:9pt;mso-wrap-distance-top:3.6pt;mso-wrap-distance-right:9pt;mso-wrap-distance-bottom:3.6pt;mso-position-horizontal:absolute;mso-position-horizontal-relative:margin;mso-position-vertical:absolute;mso-position-vertical-relative:text;mso-width-percent:0;mso-height-percent:0;mso-width-relative:margin;mso-height-relative:margin;v-text-anchor:top" o:gfxdata="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" stroked="f">
                 <v:textbox>
                   <w:txbxContent>
@@ -5122,8 +5118,6 @@
                 <w:rFonts w:ascii="Arial" w:hAnsi="Arial" w:cs="Arial"/>
               </w:rPr>
             </w:pPr>
-            <w:bookmarkStart w:id="0" w:name="_GoBack"/>
-            <w:bookmarkEnd w:id="0"/>
             <w:r>
               <w:rPr>
                 <w:rFonts w:ascii="Arial" w:hAnsi="Arial" w:cs="Arial"/>
@@ -13288,7 +13282,7 @@
               <w:rPr>
                 <w:rFonts w:ascii="Arial" w:hAnsi="Arial" w:cs="Arial"/>
               </w:rPr>
-              <w:t>Inexistencia de un responsable de TI que impulse la elaboración del plan.</w:t>
+              <w:t>Respuesta negativa a la solicitud de documentación del BCP/DRP.</w:t>
             </w:r>
           </w:p>
           <w:p>
@@ -13305,24 +13299,7 @@
               <w:rPr>
                 <w:rFonts w:ascii="Arial" w:hAnsi="Arial" w:cs="Arial"/>
               </w:rPr>
-              <w:t>Falta de conciencia sobre la dependencia crítica de la institución en la conectividad de red para la operación del SISNIVEN.</w:t>
-            </w:r>
-          </w:p>
-          <w:p>
-            <w:pPr>
-              <w:numPr>
-                <w:ilvl w:val="0"/>
-                <w:numId w:val="2"/>
-              </w:numPr>
-              <w:rPr>
-                <w:rFonts w:ascii="Arial" w:hAnsi="Arial" w:cs="Arial"/>
-              </w:rPr>
-            </w:pPr>
-            <w:r>
-              <w:rPr>
-                <w:rFonts w:ascii="Arial" w:hAnsi="Arial" w:cs="Arial"/>
-              </w:rPr>
-              <w:t>Ausencia de una política institucional de continuidad del negocio.</w:t>
+              <w:t>Entrevistas con el Director General y el Responsable de Planificación, quienes confirmaron su inexistencia.</w:t>
             </w:r>
           </w:p>
         </w:tc>
@@ -13377,7 +13354,7 @@
               <w:rPr>
                 <w:rFonts w:ascii="Arial" w:hAnsi="Arial" w:cs="Arial"/>
               </w:rPr>
-              <w:t>Inexistencia de un responsable de TI que impulse la elaboración del plan.</w:t>
+              <w:t>Ante un fallo grave, la respuesta será improvisada, con tiempos de restauración de días.</w:t>
             </w:r>
           </w:p>
           <w:p>
@@ -13394,7 +13371,7 @@
               <w:rPr>
                 <w:rFonts w:ascii="Arial" w:hAnsi="Arial" w:cs="Arial"/>
               </w:rPr>
-              <w:t>Falta de conciencia sobre la dependencia crítica de la institución en la conectividad de red para la operación del SISNIVEN.</w:t>
+              <w:t>Parálisis en la capacidad de reportar datos de vigilancia epidemiológica al MINSA Central.</w:t>
             </w:r>
           </w:p>
           <w:p>
@@ -13411,7 +13388,7 @@
               <w:rPr>
                 <w:rFonts w:ascii="Arial" w:hAnsi="Arial" w:cs="Arial"/>
               </w:rPr>
-              <w:t>Ausencia de una política institucional de continuidad del negocio.</w:t>
+              <w:t>Incumplimiento de la normativa de disponibilidad del SISNIVEN.</w:t>
             </w:r>
           </w:p>
         </w:tc>
@@ -13504,7 +13481,6 @@
                       <w:lang w:eastAsia="es-US"/>
                       <w14:ligatures w14:val="none"/>
                     </w:rPr>
-                    <w:lastRenderedPageBreak/>
                     <w:t>Riesgo Asociado</w:t>
                   </w:r>
                 </w:p>
@@ -13658,6 +13634,7 @@
                       <w:lang w:eastAsia="es-US"/>
                       <w14:ligatures w14:val="none"/>
                     </w:rPr>
+                    <w:lastRenderedPageBreak/>
                     <w:t>R-RED-001: Colapso total de la LAN por fallo catastrófico</w:t>
                   </w:r>
                 </w:p>
@@ -13811,6 +13788,7 @@
               <w:rPr>
                 <w:rFonts w:ascii="Arial" w:hAnsi="Arial" w:cs="Arial"/>
               </w:rPr>
+              <w:lastRenderedPageBreak/>
               <w:t>RECOMENDACIONES</w:t>
             </w:r>
           </w:p>
@@ -13858,6 +13836,1257 @@
               <w:rPr>
                 <w:rFonts w:ascii="Arial" w:hAnsi="Arial" w:cs="Arial"/>
               </w:rPr>
+              <w:t xml:space="preserve">Corto plazo (30-60 días): Documentar el plan, definiendo roles, procedimientos de recuperación, </w:t>
+            </w:r>
+            <w:proofErr w:type="spellStart"/>
+            <w:r>
+              <w:rPr>
+                <w:rFonts w:ascii="Arial" w:hAnsi="Arial" w:cs="Arial"/>
+              </w:rPr>
+              <w:t>RTOs</w:t>
+            </w:r>
+            <w:proofErr w:type="spellEnd"/>
+            <w:r>
+              <w:rPr>
+                <w:rFonts w:ascii="Arial" w:hAnsi="Arial" w:cs="Arial"/>
+              </w:rPr>
+              <w:t xml:space="preserve"> (</w:t>
+            </w:r>
+            <w:proofErr w:type="spellStart"/>
+            <w:r>
+              <w:rPr>
+                <w:rFonts w:ascii="Arial" w:hAnsi="Arial" w:cs="Arial"/>
+              </w:rPr>
+              <w:t>Recovery</w:t>
+            </w:r>
+            <w:proofErr w:type="spellEnd"/>
+            <w:r>
+              <w:rPr>
+                <w:rFonts w:ascii="Arial" w:hAnsi="Arial" w:cs="Arial"/>
+              </w:rPr>
+              <w:t xml:space="preserve"> Time </w:t>
+            </w:r>
+            <w:proofErr w:type="spellStart"/>
+            <w:r>
+              <w:rPr>
+                <w:rFonts w:ascii="Arial" w:hAnsi="Arial" w:cs="Arial"/>
+              </w:rPr>
+              <w:t>Objectives</w:t>
+            </w:r>
+            <w:proofErr w:type="spellEnd"/>
+            <w:r>
+              <w:rPr>
+                <w:rFonts w:ascii="Arial" w:hAnsi="Arial" w:cs="Arial"/>
+              </w:rPr>
+              <w:t>) y un listado de contactos de emergencia. Realizar una prueba de escritorio del plan.</w:t>
+            </w:r>
+          </w:p>
+        </w:tc>
+      </w:tr>
+      <w:tr>
+        <w:trPr>
+          <w:trHeight w:val="4"/>
+          <w:jc w:val="center"/>
+        </w:trPr>
+        <w:tc>
+          <w:tcPr>
+            <w:tcW w:w="7788" w:type="dxa"/>
+            <w:gridSpan w:val="4"/>
+          </w:tcPr>
+          <w:p>
+            <w:pPr>
+              <w:rPr>
+                <w:rFonts w:ascii="Arial" w:hAnsi="Arial" w:cs="Arial"/>
+              </w:rPr>
+            </w:pPr>
+            <w:bookmarkStart w:id="0" w:name="_GoBack"/>
+            <w:bookmarkEnd w:id="0"/>
+            <w:r>
+              <w:rPr>
+                <w:rFonts w:ascii="Arial" w:hAnsi="Arial" w:cs="Arial"/>
+              </w:rPr>
+              <w:t>SILAIS – SEDE MASAYA</w:t>
+            </w:r>
+          </w:p>
+        </w:tc>
+        <w:tc>
+          <w:tcPr>
+            <w:tcW w:w="3727" w:type="dxa"/>
+            <w:gridSpan w:val="3"/>
+          </w:tcPr>
+          <w:p>
+            <w:pPr>
+              <w:rPr>
+                <w:rFonts w:ascii="Arial" w:hAnsi="Arial" w:cs="Arial"/>
+              </w:rPr>
+            </w:pPr>
+            <w:r>
+              <w:rPr>
+                <w:rFonts w:ascii="Arial" w:hAnsi="Arial" w:cs="Arial"/>
+                <w:b/>
+                <w:bCs/>
+              </w:rPr>
+              <w:t>H-RED-GOB-0</w:t>
+            </w:r>
+            <w:r>
+              <w:rPr>
+                <w:rFonts w:ascii="Arial" w:hAnsi="Arial" w:cs="Arial"/>
+                <w:b/>
+                <w:bCs/>
+              </w:rPr>
+              <w:t>2</w:t>
+            </w:r>
+          </w:p>
+        </w:tc>
+      </w:tr>
+      <w:tr>
+        <w:trPr>
+          <w:trHeight w:val="3"/>
+          <w:jc w:val="center"/>
+        </w:trPr>
+        <w:tc>
+          <w:tcPr>
+            <w:tcW w:w="7788" w:type="dxa"/>
+            <w:gridSpan w:val="4"/>
+          </w:tcPr>
+          <w:p>
+            <w:pPr>
+              <w:rPr>
+                <w:rFonts w:ascii="Arial" w:hAnsi="Arial" w:cs="Arial"/>
+              </w:rPr>
+            </w:pPr>
+            <w:r>
+              <w:rPr>
+                <w:rFonts w:ascii="Arial" w:hAnsi="Arial" w:cs="Arial"/>
+              </w:rPr>
+              <w:t>HALLAZGOS DE LA AUDITORIA</w:t>
+            </w:r>
+          </w:p>
+        </w:tc>
+        <w:tc>
+          <w:tcPr>
+            <w:tcW w:w="3727" w:type="dxa"/>
+            <w:gridSpan w:val="3"/>
+          </w:tcPr>
+          <w:p>
+            <w:pPr>
+              <w:rPr>
+                <w:rFonts w:ascii="Arial" w:hAnsi="Arial" w:cs="Arial"/>
+              </w:rPr>
+            </w:pPr>
+            <w:r>
+              <w:rPr>
+                <w:rFonts w:ascii="Arial" w:hAnsi="Arial" w:cs="Arial"/>
+              </w:rPr>
+              <w:t>H9</w:t>
+            </w:r>
+          </w:p>
+        </w:tc>
+      </w:tr>
+      <w:tr>
+        <w:trPr>
+          <w:trHeight w:val="3"/>
+          <w:jc w:val="center"/>
+        </w:trPr>
+        <w:tc>
+          <w:tcPr>
+            <w:tcW w:w="3096" w:type="dxa"/>
+            <w:vMerge w:val="restart"/>
+            <w:shd w:val="clear" w:color="auto" w:fill="D0CECE" w:themeFill="background2" w:themeFillShade="E6"/>
+          </w:tcPr>
+          <w:p>
+            <w:pPr>
+              <w:rPr>
+                <w:rFonts w:ascii="Arial" w:hAnsi="Arial" w:cs="Arial"/>
+              </w:rPr>
+            </w:pPr>
+            <w:r>
+              <w:rPr>
+                <w:rFonts w:ascii="Arial" w:hAnsi="Arial" w:cs="Arial"/>
+              </w:rPr>
+              <w:t>PROCESO AUDITADO</w:t>
+            </w:r>
+          </w:p>
+        </w:tc>
+        <w:tc>
+          <w:tcPr>
+            <w:tcW w:w="4692" w:type="dxa"/>
+            <w:gridSpan w:val="3"/>
+            <w:vMerge w:val="restart"/>
+            <w:tcBorders>
+              <w:bottom w:val="nil"/>
+            </w:tcBorders>
+          </w:tcPr>
+          <w:p>
+            <w:pPr>
+              <w:rPr>
+                <w:rFonts w:ascii="Arial" w:hAnsi="Arial" w:cs="Arial"/>
+              </w:rPr>
+            </w:pPr>
+            <w:r>
+              <w:rPr>
+                <w:rFonts w:ascii="Arial" w:hAnsi="Arial" w:cs="Arial"/>
+              </w:rPr>
+              <w:t>Gestión de la Continuidad de la Red</w:t>
+            </w:r>
+          </w:p>
+        </w:tc>
+        <w:tc>
+          <w:tcPr>
+            <w:tcW w:w="3727" w:type="dxa"/>
+            <w:gridSpan w:val="3"/>
+          </w:tcPr>
+          <w:p>
+            <w:pPr>
+              <w:rPr>
+                <w:rFonts w:ascii="Arial" w:hAnsi="Arial" w:cs="Arial"/>
+              </w:rPr>
+            </w:pPr>
+            <w:r>
+              <w:rPr>
+                <w:rFonts w:ascii="Arial" w:hAnsi="Arial" w:cs="Arial"/>
+              </w:rPr>
+              <w:t xml:space="preserve">PAGINA </w:t>
+            </w:r>
+          </w:p>
+        </w:tc>
+      </w:tr>
+      <w:tr>
+        <w:trPr>
+          <w:trHeight w:val="3"/>
+          <w:jc w:val="center"/>
+        </w:trPr>
+        <w:tc>
+          <w:tcPr>
+            <w:tcW w:w="3096" w:type="dxa"/>
+            <w:vMerge/>
+            <w:shd w:val="clear" w:color="auto" w:fill="D0CECE" w:themeFill="background2" w:themeFillShade="E6"/>
+          </w:tcPr>
+          <w:p>
+            <w:pPr>
+              <w:rPr>
+                <w:rFonts w:ascii="Arial" w:hAnsi="Arial" w:cs="Arial"/>
+              </w:rPr>
+            </w:pPr>
+          </w:p>
+        </w:tc>
+        <w:tc>
+          <w:tcPr>
+            <w:tcW w:w="4692" w:type="dxa"/>
+            <w:gridSpan w:val="3"/>
+            <w:vMerge/>
+            <w:tcBorders>
+              <w:bottom w:val="nil"/>
+            </w:tcBorders>
+          </w:tcPr>
+          <w:p>
+            <w:pPr>
+              <w:rPr>
+                <w:rFonts w:ascii="Arial" w:hAnsi="Arial" w:cs="Arial"/>
+              </w:rPr>
+            </w:pPr>
+          </w:p>
+        </w:tc>
+        <w:tc>
+          <w:tcPr>
+            <w:tcW w:w="680" w:type="dxa"/>
+          </w:tcPr>
+          <w:p>
+            <w:pPr>
+              <w:rPr>
+                <w:rFonts w:ascii="Arial" w:hAnsi="Arial" w:cs="Arial"/>
+              </w:rPr>
+            </w:pPr>
+            <w:r>
+              <w:rPr>
+                <w:rFonts w:ascii="Arial" w:hAnsi="Arial" w:cs="Arial"/>
+              </w:rPr>
+              <w:t>1</w:t>
+            </w:r>
+          </w:p>
+        </w:tc>
+        <w:tc>
+          <w:tcPr>
+            <w:tcW w:w="939" w:type="dxa"/>
+          </w:tcPr>
+          <w:p>
+            <w:pPr>
+              <w:rPr>
+                <w:rFonts w:ascii="Arial" w:hAnsi="Arial" w:cs="Arial"/>
+              </w:rPr>
+            </w:pPr>
+            <w:r>
+              <w:rPr>
+                <w:rFonts w:ascii="Arial" w:hAnsi="Arial" w:cs="Arial"/>
+              </w:rPr>
+              <w:t>DE</w:t>
+            </w:r>
+          </w:p>
+        </w:tc>
+        <w:tc>
+          <w:tcPr>
+            <w:tcW w:w="2108" w:type="dxa"/>
+          </w:tcPr>
+          <w:p>
+            <w:pPr>
+              <w:rPr>
+                <w:rFonts w:ascii="Arial" w:hAnsi="Arial" w:cs="Arial"/>
+              </w:rPr>
+            </w:pPr>
+            <w:r>
+              <w:rPr>
+                <w:rFonts w:ascii="Arial" w:hAnsi="Arial" w:cs="Arial"/>
+              </w:rPr>
+              <w:t>1</w:t>
+            </w:r>
+          </w:p>
+        </w:tc>
+      </w:tr>
+      <w:tr>
+        <w:trPr>
+          <w:trHeight w:val="3"/>
+          <w:jc w:val="center"/>
+        </w:trPr>
+        <w:tc>
+          <w:tcPr>
+            <w:tcW w:w="3096" w:type="dxa"/>
+            <w:shd w:val="clear" w:color="auto" w:fill="D0CECE" w:themeFill="background2" w:themeFillShade="E6"/>
+          </w:tcPr>
+          <w:p>
+            <w:pPr>
+              <w:rPr>
+                <w:rFonts w:ascii="Arial" w:hAnsi="Arial" w:cs="Arial"/>
+              </w:rPr>
+            </w:pPr>
+            <w:r>
+              <w:rPr>
+                <w:rFonts w:ascii="Arial" w:hAnsi="Arial" w:cs="Arial"/>
+              </w:rPr>
+              <w:t>RESPONSABLE</w:t>
+            </w:r>
+          </w:p>
+        </w:tc>
+        <w:tc>
+          <w:tcPr>
+            <w:tcW w:w="8419" w:type="dxa"/>
+            <w:gridSpan w:val="6"/>
+          </w:tcPr>
+          <w:p>
+            <w:pPr>
+              <w:rPr>
+                <w:rFonts w:ascii="Arial" w:hAnsi="Arial" w:cs="Arial"/>
+              </w:rPr>
+            </w:pPr>
+          </w:p>
+        </w:tc>
+      </w:tr>
+      <w:tr>
+        <w:trPr>
+          <w:trHeight w:val="3"/>
+          <w:jc w:val="center"/>
+        </w:trPr>
+        <w:tc>
+          <w:tcPr>
+            <w:tcW w:w="3096" w:type="dxa"/>
+            <w:shd w:val="clear" w:color="auto" w:fill="D0CECE" w:themeFill="background2" w:themeFillShade="E6"/>
+          </w:tcPr>
+          <w:p>
+            <w:pPr>
+              <w:rPr>
+                <w:rFonts w:ascii="Arial" w:hAnsi="Arial" w:cs="Arial"/>
+              </w:rPr>
+            </w:pPr>
+            <w:r>
+              <w:rPr>
+                <w:rFonts w:ascii="Arial" w:hAnsi="Arial" w:cs="Arial"/>
+              </w:rPr>
+              <w:t>CRITERIO</w:t>
+            </w:r>
+          </w:p>
+        </w:tc>
+        <w:tc>
+          <w:tcPr>
+            <w:tcW w:w="8419" w:type="dxa"/>
+            <w:gridSpan w:val="6"/>
+          </w:tcPr>
+          <w:p>
+            <w:pPr>
+              <w:rPr>
+                <w:rFonts w:ascii="Arial" w:hAnsi="Arial" w:cs="Arial"/>
+              </w:rPr>
+            </w:pPr>
+            <w:r>
+              <w:rPr>
+                <w:rFonts w:ascii="Arial" w:hAnsi="Arial" w:cs="Arial"/>
+              </w:rPr>
+              <w:t>COBIT DSS04, ISO 27001 A.17.2</w:t>
+            </w:r>
+          </w:p>
+        </w:tc>
+      </w:tr>
+      <w:tr>
+        <w:trPr>
+          <w:trHeight w:val="7"/>
+          <w:jc w:val="center"/>
+        </w:trPr>
+        <w:tc>
+          <w:tcPr>
+            <w:tcW w:w="3096" w:type="dxa"/>
+            <w:shd w:val="clear" w:color="auto" w:fill="D0CECE" w:themeFill="background2" w:themeFillShade="E6"/>
+          </w:tcPr>
+          <w:p>
+            <w:pPr>
+              <w:rPr>
+                <w:rFonts w:ascii="Arial" w:hAnsi="Arial" w:cs="Arial"/>
+              </w:rPr>
+            </w:pPr>
+            <w:r>
+              <w:rPr>
+                <w:rFonts w:ascii="Arial" w:hAnsi="Arial" w:cs="Arial"/>
+              </w:rPr>
+              <w:t>DOMINIO</w:t>
+            </w:r>
+          </w:p>
+        </w:tc>
+        <w:tc>
+          <w:tcPr>
+            <w:tcW w:w="2341" w:type="dxa"/>
+          </w:tcPr>
+          <w:p>
+            <w:pPr>
+              <w:rPr>
+                <w:rFonts w:ascii="Arial" w:hAnsi="Arial" w:cs="Arial"/>
+              </w:rPr>
+            </w:pPr>
+            <w:r>
+              <w:rPr>
+                <w:rFonts w:ascii="Arial" w:hAnsi="Arial" w:cs="Arial"/>
+              </w:rPr>
+              <w:t>DSS (Entregar, Dar Servicio y Soporte)</w:t>
+            </w:r>
+          </w:p>
+        </w:tc>
+        <w:tc>
+          <w:tcPr>
+            <w:tcW w:w="2203" w:type="dxa"/>
+            <w:shd w:val="clear" w:color="auto" w:fill="D0CECE" w:themeFill="background2" w:themeFillShade="E6"/>
+          </w:tcPr>
+          <w:p>
+            <w:pPr>
+              <w:rPr>
+                <w:rFonts w:ascii="Arial" w:hAnsi="Arial" w:cs="Arial"/>
+              </w:rPr>
+            </w:pPr>
+            <w:r>
+              <w:rPr>
+                <w:rFonts w:ascii="Arial" w:hAnsi="Arial" w:cs="Arial"/>
+              </w:rPr>
+              <w:t>PROCESO</w:t>
+            </w:r>
+          </w:p>
+        </w:tc>
+        <w:tc>
+          <w:tcPr>
+            <w:tcW w:w="3875" w:type="dxa"/>
+            <w:gridSpan w:val="4"/>
+          </w:tcPr>
+          <w:p>
+            <w:pPr>
+              <w:rPr>
+                <w:rFonts w:ascii="Arial" w:hAnsi="Arial" w:cs="Arial"/>
+              </w:rPr>
+            </w:pPr>
+            <w:r>
+              <w:rPr>
+                <w:rFonts w:ascii="Arial" w:hAnsi="Arial" w:cs="Arial"/>
+              </w:rPr>
+              <w:t>DSS04 – Gestión de la Continuidad</w:t>
+            </w:r>
+          </w:p>
+        </w:tc>
+      </w:tr>
+      <w:tr>
+        <w:trPr>
+          <w:trHeight w:val="3"/>
+          <w:jc w:val="center"/>
+        </w:trPr>
+        <w:tc>
+          <w:tcPr>
+            <w:tcW w:w="11515" w:type="dxa"/>
+            <w:gridSpan w:val="7"/>
+            <w:shd w:val="clear" w:color="auto" w:fill="D0CECE" w:themeFill="background2" w:themeFillShade="E6"/>
+          </w:tcPr>
+          <w:p>
+            <w:pPr>
+              <w:rPr>
+                <w:rFonts w:ascii="Arial" w:hAnsi="Arial" w:cs="Arial"/>
+                <w:lang w:val="es-419"/>
+              </w:rPr>
+            </w:pPr>
+            <w:r>
+              <w:rPr>
+                <w:rFonts w:ascii="Arial" w:hAnsi="Arial" w:cs="Arial"/>
+              </w:rPr>
+              <w:t>DESCRIPCI</w:t>
+            </w:r>
+            <w:r>
+              <w:rPr>
+                <w:rFonts w:ascii="Arial" w:hAnsi="Arial" w:cs="Arial"/>
+                <w:lang w:val="es-419"/>
+              </w:rPr>
+              <w:t>ÓN DEL HALLAZGO</w:t>
+            </w:r>
+          </w:p>
+        </w:tc>
+      </w:tr>
+      <w:tr>
+        <w:trPr>
+          <w:trHeight w:val="21"/>
+          <w:jc w:val="center"/>
+        </w:trPr>
+        <w:tc>
+          <w:tcPr>
+            <w:tcW w:w="11515" w:type="dxa"/>
+            <w:gridSpan w:val="7"/>
+          </w:tcPr>
+          <w:p>
+            <w:pPr>
+              <w:rPr>
+                <w:rFonts w:ascii="Arial" w:hAnsi="Arial" w:cs="Arial"/>
+              </w:rPr>
+            </w:pPr>
+            <w:r>
+              <w:rPr>
+                <w:rFonts w:ascii="Arial" w:hAnsi="Arial" w:cs="Arial"/>
+              </w:rPr>
+              <w:t xml:space="preserve">El SILAIS – Sede Masaya no cuenta con un Plan de Continuidad de Negocio o Recuperación ante Desastres (BCP/DRP) para la infraestructura de red. No existen procedimientos documentados que describan las acciones a tomar para restablecer la conectividad en caso de un fallo catastrófico del </w:t>
+            </w:r>
+            <w:proofErr w:type="spellStart"/>
+            <w:r>
+              <w:rPr>
+                <w:rFonts w:ascii="Arial" w:hAnsi="Arial" w:cs="Arial"/>
+              </w:rPr>
+              <w:t>switch</w:t>
+            </w:r>
+            <w:proofErr w:type="spellEnd"/>
+            <w:r>
+              <w:rPr>
+                <w:rFonts w:ascii="Arial" w:hAnsi="Arial" w:cs="Arial"/>
+              </w:rPr>
+              <w:t xml:space="preserve"> principal, la pérdida del enlace con el MINSA Central o cualquier otro incidente que paralice las comunicaciones.</w:t>
+            </w:r>
+          </w:p>
+        </w:tc>
+      </w:tr>
+      <w:tr>
+        <w:trPr>
+          <w:trHeight w:val="3"/>
+          <w:jc w:val="center"/>
+        </w:trPr>
+        <w:tc>
+          <w:tcPr>
+            <w:tcW w:w="11515" w:type="dxa"/>
+            <w:gridSpan w:val="7"/>
+            <w:shd w:val="clear" w:color="auto" w:fill="D0CECE" w:themeFill="background2" w:themeFillShade="E6"/>
+          </w:tcPr>
+          <w:p>
+            <w:pPr>
+              <w:rPr>
+                <w:rFonts w:ascii="Arial" w:hAnsi="Arial" w:cs="Arial"/>
+              </w:rPr>
+            </w:pPr>
+            <w:r>
+              <w:rPr>
+                <w:rFonts w:ascii="Arial" w:hAnsi="Arial" w:cs="Arial"/>
+              </w:rPr>
+              <w:t>CAUSAS</w:t>
+            </w:r>
+          </w:p>
+        </w:tc>
+      </w:tr>
+      <w:tr>
+        <w:trPr>
+          <w:trHeight w:val="1241"/>
+          <w:jc w:val="center"/>
+        </w:trPr>
+        <w:tc>
+          <w:tcPr>
+            <w:tcW w:w="11515" w:type="dxa"/>
+            <w:gridSpan w:val="7"/>
+          </w:tcPr>
+          <w:p>
+            <w:pPr>
+              <w:numPr>
+                <w:ilvl w:val="0"/>
+                <w:numId w:val="1"/>
+              </w:numPr>
+              <w:rPr>
+                <w:rFonts w:ascii="Arial" w:hAnsi="Arial" w:cs="Arial"/>
+              </w:rPr>
+            </w:pPr>
+            <w:r>
+              <w:rPr>
+                <w:rFonts w:ascii="Arial" w:hAnsi="Arial" w:cs="Arial"/>
+              </w:rPr>
+              <w:t>Inexistencia de un responsable de TI que impulse la elaboración del plan.</w:t>
+            </w:r>
+          </w:p>
+          <w:p>
+            <w:pPr>
+              <w:numPr>
+                <w:ilvl w:val="0"/>
+                <w:numId w:val="1"/>
+              </w:numPr>
+              <w:rPr>
+                <w:rFonts w:ascii="Arial" w:hAnsi="Arial" w:cs="Arial"/>
+              </w:rPr>
+            </w:pPr>
+            <w:r>
+              <w:rPr>
+                <w:rFonts w:ascii="Arial" w:hAnsi="Arial" w:cs="Arial"/>
+              </w:rPr>
+              <w:t>Falta de conciencia sobre la dependencia crítica de la institución en la conectividad de red para la operación del SISNIVEN.</w:t>
+            </w:r>
+          </w:p>
+          <w:p>
+            <w:pPr>
+              <w:numPr>
+                <w:ilvl w:val="0"/>
+                <w:numId w:val="1"/>
+              </w:numPr>
+              <w:rPr>
+                <w:rFonts w:ascii="Arial" w:hAnsi="Arial" w:cs="Arial"/>
+              </w:rPr>
+            </w:pPr>
+            <w:r>
+              <w:rPr>
+                <w:rFonts w:ascii="Arial" w:hAnsi="Arial" w:cs="Arial"/>
+              </w:rPr>
+              <w:t>Ausencia de una política institucional de continuidad del negocio.</w:t>
+            </w:r>
+          </w:p>
+        </w:tc>
+      </w:tr>
+      <w:tr>
+        <w:trPr>
+          <w:trHeight w:val="3"/>
+          <w:jc w:val="center"/>
+        </w:trPr>
+        <w:tc>
+          <w:tcPr>
+            <w:tcW w:w="11515" w:type="dxa"/>
+            <w:gridSpan w:val="7"/>
+            <w:shd w:val="clear" w:color="auto" w:fill="D0CECE" w:themeFill="background2" w:themeFillShade="E6"/>
+          </w:tcPr>
+          <w:p>
+            <w:pPr>
+              <w:rPr>
+                <w:rFonts w:ascii="Arial" w:hAnsi="Arial" w:cs="Arial"/>
+              </w:rPr>
+            </w:pPr>
+            <w:r>
+              <w:rPr>
+                <w:rFonts w:ascii="Arial" w:hAnsi="Arial" w:cs="Arial"/>
+              </w:rPr>
+              <w:t>EVIDENCIA</w:t>
+            </w:r>
+          </w:p>
+        </w:tc>
+      </w:tr>
+      <w:tr>
+        <w:trPr>
+          <w:trHeight w:val="17"/>
+          <w:jc w:val="center"/>
+        </w:trPr>
+        <w:tc>
+          <w:tcPr>
+            <w:tcW w:w="11515" w:type="dxa"/>
+            <w:gridSpan w:val="7"/>
+          </w:tcPr>
+          <w:p>
+            <w:pPr>
+              <w:numPr>
+                <w:ilvl w:val="0"/>
+                <w:numId w:val="2"/>
+              </w:numPr>
+              <w:rPr>
+                <w:rFonts w:ascii="Arial" w:hAnsi="Arial" w:cs="Arial"/>
+              </w:rPr>
+            </w:pPr>
+            <w:r>
+              <w:rPr>
+                <w:rFonts w:ascii="Arial" w:hAnsi="Arial" w:cs="Arial"/>
+              </w:rPr>
+              <w:t>Inexistencia de un responsable de TI que impulse la elaboración del plan.</w:t>
+            </w:r>
+          </w:p>
+          <w:p>
+            <w:pPr>
+              <w:numPr>
+                <w:ilvl w:val="0"/>
+                <w:numId w:val="2"/>
+              </w:numPr>
+              <w:rPr>
+                <w:rFonts w:ascii="Arial" w:hAnsi="Arial" w:cs="Arial"/>
+              </w:rPr>
+            </w:pPr>
+            <w:r>
+              <w:rPr>
+                <w:rFonts w:ascii="Arial" w:hAnsi="Arial" w:cs="Arial"/>
+              </w:rPr>
+              <w:t>Falta de conciencia sobre la dependencia crítica de la institución en la conectividad de red para la operación del SISNIVEN.</w:t>
+            </w:r>
+          </w:p>
+          <w:p>
+            <w:pPr>
+              <w:numPr>
+                <w:ilvl w:val="0"/>
+                <w:numId w:val="2"/>
+              </w:numPr>
+              <w:rPr>
+                <w:rFonts w:ascii="Arial" w:hAnsi="Arial" w:cs="Arial"/>
+              </w:rPr>
+            </w:pPr>
+            <w:r>
+              <w:rPr>
+                <w:rFonts w:ascii="Arial" w:hAnsi="Arial" w:cs="Arial"/>
+              </w:rPr>
+              <w:t>Ausencia de una política institucional de continuidad del negocio.</w:t>
+            </w:r>
+          </w:p>
+        </w:tc>
+      </w:tr>
+      <w:tr>
+        <w:trPr>
+          <w:trHeight w:val="3"/>
+          <w:jc w:val="center"/>
+        </w:trPr>
+        <w:tc>
+          <w:tcPr>
+            <w:tcW w:w="11515" w:type="dxa"/>
+            <w:gridSpan w:val="7"/>
+            <w:shd w:val="clear" w:color="auto" w:fill="D0CECE" w:themeFill="background2" w:themeFillShade="E6"/>
+          </w:tcPr>
+          <w:p>
+            <w:pPr>
+              <w:rPr>
+                <w:rFonts w:ascii="Arial" w:hAnsi="Arial" w:cs="Arial"/>
+              </w:rPr>
+            </w:pPr>
+            <w:r>
+              <w:rPr>
+                <w:rFonts w:ascii="Arial" w:hAnsi="Arial" w:cs="Arial"/>
+              </w:rPr>
+              <w:t>IMPACTO</w:t>
+            </w:r>
+          </w:p>
+        </w:tc>
+      </w:tr>
+      <w:tr>
+        <w:trPr>
+          <w:trHeight w:val="10"/>
+          <w:jc w:val="center"/>
+        </w:trPr>
+        <w:tc>
+          <w:tcPr>
+            <w:tcW w:w="11515" w:type="dxa"/>
+            <w:gridSpan w:val="7"/>
+          </w:tcPr>
+          <w:p>
+            <w:pPr>
+              <w:numPr>
+                <w:ilvl w:val="0"/>
+                <w:numId w:val="9"/>
+              </w:numPr>
+              <w:rPr>
+                <w:rFonts w:ascii="Arial" w:hAnsi="Arial" w:cs="Arial"/>
+              </w:rPr>
+            </w:pPr>
+            <w:r>
+              <w:rPr>
+                <w:rFonts w:ascii="Arial" w:hAnsi="Arial" w:cs="Arial"/>
+              </w:rPr>
+              <w:t>Inexistencia de un responsable de TI que impulse la elaboración del plan.</w:t>
+            </w:r>
+          </w:p>
+          <w:p>
+            <w:pPr>
+              <w:numPr>
+                <w:ilvl w:val="0"/>
+                <w:numId w:val="9"/>
+              </w:numPr>
+              <w:rPr>
+                <w:rFonts w:ascii="Arial" w:hAnsi="Arial" w:cs="Arial"/>
+              </w:rPr>
+            </w:pPr>
+            <w:r>
+              <w:rPr>
+                <w:rFonts w:ascii="Arial" w:hAnsi="Arial" w:cs="Arial"/>
+              </w:rPr>
+              <w:t>Falta de conciencia sobre la dependencia crítica de la institución en la conectividad de red para la operación del SISNIVEN.</w:t>
+            </w:r>
+          </w:p>
+          <w:p>
+            <w:pPr>
+              <w:numPr>
+                <w:ilvl w:val="0"/>
+                <w:numId w:val="9"/>
+              </w:numPr>
+              <w:rPr>
+                <w:rFonts w:ascii="Arial" w:hAnsi="Arial" w:cs="Arial"/>
+              </w:rPr>
+            </w:pPr>
+            <w:r>
+              <w:rPr>
+                <w:rFonts w:ascii="Arial" w:hAnsi="Arial" w:cs="Arial"/>
+              </w:rPr>
+              <w:t>Ausencia de una política institucional de continuidad del negocio.</w:t>
+            </w:r>
+          </w:p>
+        </w:tc>
+      </w:tr>
+      <w:tr>
+        <w:trPr>
+          <w:trHeight w:val="3"/>
+          <w:jc w:val="center"/>
+        </w:trPr>
+        <w:tc>
+          <w:tcPr>
+            <w:tcW w:w="11515" w:type="dxa"/>
+            <w:gridSpan w:val="7"/>
+            <w:shd w:val="clear" w:color="auto" w:fill="D0CECE" w:themeFill="background2" w:themeFillShade="E6"/>
+          </w:tcPr>
+          <w:p>
+            <w:pPr>
+              <w:rPr>
+                <w:rFonts w:ascii="Arial" w:hAnsi="Arial" w:cs="Arial"/>
+              </w:rPr>
+            </w:pPr>
+            <w:r>
+              <w:rPr>
+                <w:rFonts w:ascii="Arial" w:hAnsi="Arial" w:cs="Arial"/>
+              </w:rPr>
+              <w:t>VALORACIÓN DEL RIESGO</w:t>
+            </w:r>
+          </w:p>
+        </w:tc>
+      </w:tr>
+      <w:tr>
+        <w:trPr>
+          <w:trHeight w:val="16"/>
+          <w:jc w:val="center"/>
+        </w:trPr>
+        <w:tc>
+          <w:tcPr>
+            <w:tcW w:w="11515" w:type="dxa"/>
+            <w:gridSpan w:val="7"/>
+          </w:tcPr>
+          <w:tbl>
+            <w:tblPr>
+              <w:tblW w:w="8947" w:type="dxa"/>
+              <w:tblCellMar>
+                <w:left w:w="70" w:type="dxa"/>
+                <w:right w:w="70" w:type="dxa"/>
+              </w:tblCellMar>
+              <w:tblLook w:val="04A0" w:firstRow="1" w:lastRow="0" w:firstColumn="1" w:lastColumn="0" w:noHBand="0" w:noVBand="1"/>
+            </w:tblPr>
+            <w:tblGrid>
+              <w:gridCol w:w="5061"/>
+              <w:gridCol w:w="1421"/>
+              <w:gridCol w:w="1475"/>
+              <w:gridCol w:w="1240"/>
+            </w:tblGrid>
+            <w:tr>
+              <w:trPr>
+                <w:trHeight w:val="288"/>
+              </w:trPr>
+              <w:tc>
+                <w:tcPr>
+                  <w:tcW w:w="5061" w:type="dxa"/>
+                  <w:tcBorders>
+                    <w:top w:val="nil"/>
+                    <w:left w:val="nil"/>
+                    <w:bottom w:val="nil"/>
+                    <w:right w:val="nil"/>
+                  </w:tcBorders>
+                  <w:shd w:val="clear" w:color="auto" w:fill="auto"/>
+                  <w:noWrap/>
+                  <w:vAlign w:val="bottom"/>
+                  <w:hideMark/>
+                </w:tcPr>
+                <w:p>
+                  <w:pPr>
+                    <w:spacing w:after="0" w:line="240" w:lineRule="auto"/>
+                    <w:rPr>
+                      <w:rFonts w:ascii="Arial" w:eastAsia="Times New Roman" w:hAnsi="Arial" w:cs="Arial"/>
+                      <w:color w:val="000000"/>
+                      <w:kern w:val="0"/>
+                      <w:lang w:eastAsia="es-US"/>
+                      <w14:ligatures w14:val="none"/>
+                    </w:rPr>
+                  </w:pPr>
+                  <w:r>
+                    <w:rPr>
+                      <w:rFonts w:ascii="Arial" w:eastAsia="Times New Roman" w:hAnsi="Arial" w:cs="Arial"/>
+                      <w:color w:val="000000"/>
+                      <w:kern w:val="0"/>
+                      <w:lang w:eastAsia="es-US"/>
+                      <w14:ligatures w14:val="none"/>
+                    </w:rPr>
+                    <w:t>Riesgo Asociado</w:t>
+                  </w:r>
+                </w:p>
+              </w:tc>
+              <w:tc>
+                <w:tcPr>
+                  <w:tcW w:w="1406" w:type="dxa"/>
+                  <w:tcBorders>
+                    <w:top w:val="nil"/>
+                    <w:left w:val="nil"/>
+                    <w:bottom w:val="nil"/>
+                    <w:right w:val="nil"/>
+                  </w:tcBorders>
+                  <w:shd w:val="clear" w:color="auto" w:fill="auto"/>
+                  <w:noWrap/>
+                  <w:vAlign w:val="bottom"/>
+                  <w:hideMark/>
+                </w:tcPr>
+                <w:p>
+                  <w:pPr>
+                    <w:spacing w:after="0" w:line="240" w:lineRule="auto"/>
+                    <w:rPr>
+                      <w:rFonts w:ascii="Arial" w:eastAsia="Times New Roman" w:hAnsi="Arial" w:cs="Arial"/>
+                      <w:color w:val="000000"/>
+                      <w:kern w:val="0"/>
+                      <w:lang w:eastAsia="es-US"/>
+                      <w14:ligatures w14:val="none"/>
+                    </w:rPr>
+                  </w:pPr>
+                  <w:r>
+                    <w:rPr>
+                      <w:rFonts w:ascii="Arial" w:eastAsia="Times New Roman" w:hAnsi="Arial" w:cs="Arial"/>
+                      <w:color w:val="000000"/>
+                      <w:kern w:val="0"/>
+                      <w:lang w:eastAsia="es-US"/>
+                      <w14:ligatures w14:val="none"/>
+                    </w:rPr>
+                    <w:t>Impacto</w:t>
+                  </w:r>
+                </w:p>
+              </w:tc>
+              <w:tc>
+                <w:tcPr>
+                  <w:tcW w:w="1240" w:type="dxa"/>
+                  <w:tcBorders>
+                    <w:top w:val="nil"/>
+                    <w:left w:val="nil"/>
+                    <w:bottom w:val="nil"/>
+                    <w:right w:val="nil"/>
+                  </w:tcBorders>
+                  <w:shd w:val="clear" w:color="auto" w:fill="auto"/>
+                  <w:noWrap/>
+                  <w:vAlign w:val="bottom"/>
+                  <w:hideMark/>
+                </w:tcPr>
+                <w:p>
+                  <w:pPr>
+                    <w:spacing w:after="0" w:line="240" w:lineRule="auto"/>
+                    <w:rPr>
+                      <w:rFonts w:ascii="Arial" w:eastAsia="Times New Roman" w:hAnsi="Arial" w:cs="Arial"/>
+                      <w:color w:val="000000"/>
+                      <w:kern w:val="0"/>
+                      <w:lang w:eastAsia="es-US"/>
+                      <w14:ligatures w14:val="none"/>
+                    </w:rPr>
+                  </w:pPr>
+                  <w:r>
+                    <w:rPr>
+                      <w:rFonts w:ascii="Arial" w:eastAsia="Times New Roman" w:hAnsi="Arial" w:cs="Arial"/>
+                      <w:color w:val="000000"/>
+                      <w:kern w:val="0"/>
+                      <w:lang w:eastAsia="es-US"/>
+                      <w14:ligatures w14:val="none"/>
+                    </w:rPr>
+                    <w:t>Probabilidad</w:t>
+                  </w:r>
+                </w:p>
+              </w:tc>
+              <w:tc>
+                <w:tcPr>
+                  <w:tcW w:w="1240" w:type="dxa"/>
+                  <w:tcBorders>
+                    <w:top w:val="nil"/>
+                    <w:left w:val="nil"/>
+                    <w:bottom w:val="nil"/>
+                    <w:right w:val="nil"/>
+                  </w:tcBorders>
+                  <w:shd w:val="clear" w:color="auto" w:fill="auto"/>
+                  <w:noWrap/>
+                  <w:vAlign w:val="bottom"/>
+                  <w:hideMark/>
+                </w:tcPr>
+                <w:p>
+                  <w:pPr>
+                    <w:spacing w:after="0" w:line="240" w:lineRule="auto"/>
+                    <w:rPr>
+                      <w:rFonts w:ascii="Arial" w:eastAsia="Times New Roman" w:hAnsi="Arial" w:cs="Arial"/>
+                      <w:color w:val="000000"/>
+                      <w:kern w:val="0"/>
+                      <w:lang w:eastAsia="es-US"/>
+                      <w14:ligatures w14:val="none"/>
+                    </w:rPr>
+                  </w:pPr>
+                  <w:r>
+                    <w:rPr>
+                      <w:rFonts w:ascii="Arial" w:eastAsia="Times New Roman" w:hAnsi="Arial" w:cs="Arial"/>
+                      <w:color w:val="000000"/>
+                      <w:kern w:val="0"/>
+                      <w:lang w:eastAsia="es-US"/>
+                      <w14:ligatures w14:val="none"/>
+                    </w:rPr>
+                    <w:t>Nivel de Riesgo</w:t>
+                  </w:r>
+                </w:p>
+              </w:tc>
+            </w:tr>
+            <w:tr>
+              <w:trPr>
+                <w:trHeight w:val="288"/>
+              </w:trPr>
+              <w:tc>
+                <w:tcPr>
+                  <w:tcW w:w="5061" w:type="dxa"/>
+                  <w:tcBorders>
+                    <w:top w:val="nil"/>
+                    <w:left w:val="nil"/>
+                    <w:bottom w:val="nil"/>
+                    <w:right w:val="nil"/>
+                  </w:tcBorders>
+                  <w:shd w:val="clear" w:color="auto" w:fill="auto"/>
+                  <w:noWrap/>
+                  <w:vAlign w:val="bottom"/>
+                  <w:hideMark/>
+                </w:tcPr>
+                <w:p>
+                  <w:pPr>
+                    <w:spacing w:after="0" w:line="240" w:lineRule="auto"/>
+                    <w:rPr>
+                      <w:rFonts w:ascii="Arial" w:eastAsia="Times New Roman" w:hAnsi="Arial" w:cs="Arial"/>
+                      <w:color w:val="000000"/>
+                      <w:kern w:val="0"/>
+                      <w:lang w:eastAsia="es-US"/>
+                      <w14:ligatures w14:val="none"/>
+                    </w:rPr>
+                  </w:pPr>
+                  <w:r>
+                    <w:rPr>
+                      <w:rFonts w:ascii="Arial" w:eastAsia="Times New Roman" w:hAnsi="Arial" w:cs="Arial"/>
+                      <w:color w:val="000000"/>
+                      <w:kern w:val="0"/>
+                      <w:lang w:eastAsia="es-US"/>
+                      <w14:ligatures w14:val="none"/>
+                    </w:rPr>
+                    <w:t>R-RED-001: Colapso total de la LAN por fallo catastrófico</w:t>
+                  </w:r>
+                </w:p>
+              </w:tc>
+              <w:tc>
+                <w:tcPr>
+                  <w:tcW w:w="1406" w:type="dxa"/>
+                  <w:tcBorders>
+                    <w:top w:val="nil"/>
+                    <w:left w:val="nil"/>
+                    <w:bottom w:val="nil"/>
+                    <w:right w:val="nil"/>
+                  </w:tcBorders>
+                  <w:shd w:val="clear" w:color="auto" w:fill="auto"/>
+                  <w:noWrap/>
+                  <w:vAlign w:val="bottom"/>
+                  <w:hideMark/>
+                </w:tcPr>
+                <w:p>
+                  <w:pPr>
+                    <w:spacing w:after="0" w:line="240" w:lineRule="auto"/>
+                    <w:rPr>
+                      <w:rFonts w:ascii="Arial" w:eastAsia="Times New Roman" w:hAnsi="Arial" w:cs="Arial"/>
+                      <w:color w:val="000000"/>
+                      <w:kern w:val="0"/>
+                      <w:lang w:eastAsia="es-US"/>
+                      <w14:ligatures w14:val="none"/>
+                    </w:rPr>
+                  </w:pPr>
+                  <w:r>
+                    <w:rPr>
+                      <w:rFonts w:ascii="Arial" w:eastAsia="Times New Roman" w:hAnsi="Arial" w:cs="Arial"/>
+                      <w:color w:val="000000"/>
+                      <w:kern w:val="0"/>
+                      <w:lang w:eastAsia="es-US"/>
+                      <w14:ligatures w14:val="none"/>
+                    </w:rPr>
+                    <w:t>Catastrófico (5)</w:t>
+                  </w:r>
+                </w:p>
+              </w:tc>
+              <w:tc>
+                <w:tcPr>
+                  <w:tcW w:w="1240" w:type="dxa"/>
+                  <w:tcBorders>
+                    <w:top w:val="nil"/>
+                    <w:left w:val="nil"/>
+                    <w:bottom w:val="nil"/>
+                    <w:right w:val="nil"/>
+                  </w:tcBorders>
+                  <w:shd w:val="clear" w:color="auto" w:fill="auto"/>
+                  <w:noWrap/>
+                  <w:vAlign w:val="bottom"/>
+                  <w:hideMark/>
+                </w:tcPr>
+                <w:p>
+                  <w:pPr>
+                    <w:spacing w:after="0" w:line="240" w:lineRule="auto"/>
+                    <w:rPr>
+                      <w:rFonts w:ascii="Arial" w:eastAsia="Times New Roman" w:hAnsi="Arial" w:cs="Arial"/>
+                      <w:color w:val="000000"/>
+                      <w:kern w:val="0"/>
+                      <w:lang w:eastAsia="es-US"/>
+                      <w14:ligatures w14:val="none"/>
+                    </w:rPr>
+                  </w:pPr>
+                  <w:r>
+                    <w:rPr>
+                      <w:rFonts w:ascii="Arial" w:eastAsia="Times New Roman" w:hAnsi="Arial" w:cs="Arial"/>
+                      <w:color w:val="000000"/>
+                      <w:kern w:val="0"/>
+                      <w:lang w:eastAsia="es-US"/>
+                      <w14:ligatures w14:val="none"/>
+                    </w:rPr>
+                    <w:t>Alta (4)</w:t>
+                  </w:r>
+                </w:p>
+              </w:tc>
+              <w:tc>
+                <w:tcPr>
+                  <w:tcW w:w="1240" w:type="dxa"/>
+                  <w:tcBorders>
+                    <w:top w:val="nil"/>
+                    <w:left w:val="nil"/>
+                    <w:bottom w:val="nil"/>
+                    <w:right w:val="nil"/>
+                  </w:tcBorders>
+                  <w:shd w:val="clear" w:color="auto" w:fill="auto"/>
+                  <w:noWrap/>
+                  <w:vAlign w:val="bottom"/>
+                  <w:hideMark/>
+                </w:tcPr>
+                <w:p>
+                  <w:pPr>
+                    <w:spacing w:after="0" w:line="240" w:lineRule="auto"/>
+                    <w:rPr>
+                      <w:rFonts w:ascii="Arial" w:eastAsia="Times New Roman" w:hAnsi="Arial" w:cs="Arial"/>
+                      <w:color w:val="000000"/>
+                      <w:kern w:val="0"/>
+                      <w:lang w:eastAsia="es-US"/>
+                      <w14:ligatures w14:val="none"/>
+                    </w:rPr>
+                  </w:pPr>
+                  <w:r>
+                    <w:rPr>
+                      <w:rFonts w:ascii="Arial" w:eastAsia="Times New Roman" w:hAnsi="Arial" w:cs="Arial"/>
+                      <w:color w:val="000000"/>
+                      <w:kern w:val="0"/>
+                      <w:lang w:eastAsia="es-US"/>
+                      <w14:ligatures w14:val="none"/>
+                    </w:rPr>
+                    <w:t>Extremo (20)</w:t>
+                  </w:r>
+                </w:p>
+              </w:tc>
+            </w:tr>
+          </w:tbl>
+          <w:p>
+            <w:pPr>
+              <w:rPr>
+                <w:rFonts w:ascii="Arial" w:hAnsi="Arial" w:cs="Arial"/>
+              </w:rPr>
+            </w:pPr>
+          </w:p>
+        </w:tc>
+      </w:tr>
+      <w:tr>
+        <w:trPr>
+          <w:trHeight w:val="16"/>
+          <w:jc w:val="center"/>
+        </w:trPr>
+        <w:tc>
+          <w:tcPr>
+            <w:tcW w:w="11515" w:type="dxa"/>
+            <w:gridSpan w:val="7"/>
+            <w:shd w:val="clear" w:color="auto" w:fill="D0CECE" w:themeFill="background2" w:themeFillShade="E6"/>
+          </w:tcPr>
+          <w:p>
+            <w:pPr>
+              <w:rPr>
+                <w:rFonts w:ascii="Arial" w:eastAsia="Times New Roman" w:hAnsi="Arial" w:cs="Arial"/>
+                <w:color w:val="000000"/>
+                <w:kern w:val="0"/>
+                <w:sz w:val="22"/>
+                <w:szCs w:val="22"/>
+                <w:lang w:eastAsia="es-US"/>
+                <w14:ligatures w14:val="none"/>
+              </w:rPr>
+            </w:pPr>
+            <w:r>
+              <w:rPr>
+                <w:rFonts w:ascii="Arial" w:hAnsi="Arial" w:cs="Arial"/>
+              </w:rPr>
+              <w:t>RECOMENDACIONES</w:t>
+            </w:r>
+          </w:p>
+        </w:tc>
+      </w:tr>
+      <w:tr>
+        <w:trPr>
+          <w:trHeight w:val="3"/>
+          <w:jc w:val="center"/>
+        </w:trPr>
+        <w:tc>
+          <w:tcPr>
+            <w:tcW w:w="11515" w:type="dxa"/>
+            <w:gridSpan w:val="7"/>
+            <w:shd w:val="clear" w:color="auto" w:fill="FFFFFF" w:themeFill="background1"/>
+          </w:tcPr>
+          <w:p>
+            <w:pPr>
+              <w:numPr>
+                <w:ilvl w:val="0"/>
+                <w:numId w:val="16"/>
+              </w:numPr>
+              <w:rPr>
+                <w:rFonts w:ascii="Arial" w:hAnsi="Arial" w:cs="Arial"/>
+              </w:rPr>
+            </w:pPr>
+            <w:r>
+              <w:rPr>
+                <w:rFonts w:ascii="Arial" w:hAnsi="Arial" w:cs="Arial"/>
+              </w:rPr>
+              <w:t>Inmediato (0-15 días): Convocar a un grupo de trabajo multidisciplinario para la elaboración del Plan de Continuidad y Recuperación ante Desastres de la red.</w:t>
+            </w:r>
+          </w:p>
+          <w:p>
+            <w:pPr>
+              <w:numPr>
+                <w:ilvl w:val="0"/>
+                <w:numId w:val="16"/>
+              </w:numPr>
+              <w:rPr>
+                <w:rFonts w:ascii="Arial" w:hAnsi="Arial" w:cs="Arial"/>
+              </w:rPr>
+            </w:pPr>
+            <w:r>
+              <w:rPr>
+                <w:rFonts w:ascii="Arial" w:hAnsi="Arial" w:cs="Arial"/>
+              </w:rPr>
+              <w:lastRenderedPageBreak/>
               <w:t xml:space="preserve">Corto plazo (30-60 días): Documentar el plan, definiendo roles, procedimientos de recuperación, </w:t>
             </w:r>
             <w:proofErr w:type="spellStart"/>
@@ -14934,18 +16163,7 @@
                       <w:lang w:eastAsia="es-US"/>
                       <w14:ligatures w14:val="none"/>
                     </w:rPr>
-                    <w:t xml:space="preserve">Nivel de </w:t>
-                  </w:r>
-                  <w:r>
-                    <w:rPr>
-                      <w:rFonts w:ascii="Arial" w:eastAsia="Times New Roman" w:hAnsi="Arial" w:cs="Arial"/>
-                      <w:color w:val="000000"/>
-                      <w:kern w:val="0"/>
-                      <w:lang w:eastAsia="es-US"/>
-                      <w14:ligatures w14:val="none"/>
-                    </w:rPr>
-                    <w:lastRenderedPageBreak/>
-                    <w:t>Riesgo</w:t>
+                    <w:t>Nivel de Riesgo</w:t>
                   </w:r>
                 </w:p>
               </w:tc>
@@ -14987,7 +16205,6 @@
                       <w:lang w:eastAsia="es-US"/>
                       <w14:ligatures w14:val="none"/>
                     </w:rPr>
-                    <w:lastRenderedPageBreak/>
                     <w:t xml:space="preserve">Proceso DSS03 no implementado: </w:t>
                   </w:r>
                   <w:proofErr w:type="spellStart"/>
@@ -15163,7 +16380,6 @@
               <w:rPr>
                 <w:rFonts w:ascii="Arial" w:hAnsi="Arial" w:cs="Arial"/>
               </w:rPr>
-              <w:lastRenderedPageBreak/>
               <w:t>RECOMENDACIONES</w:t>
             </w:r>
           </w:p>
@@ -15218,6 +16434,7 @@
               <w:rPr>
                 <w:rFonts w:ascii="Arial" w:hAnsi="Arial" w:cs="Arial"/>
               </w:rPr>
+              <w:lastRenderedPageBreak/>
               <w:t>Known</w:t>
             </w:r>
             <w:proofErr w:type="spellEnd"/>
@@ -16278,18 +17495,7 @@
                       <w:lang w:eastAsia="es-US"/>
                       <w14:ligatures w14:val="none"/>
                     </w:rPr>
-                    <w:t xml:space="preserve">Nivel de </w:t>
-                  </w:r>
-                  <w:r>
-                    <w:rPr>
-                      <w:rFonts w:ascii="Arial" w:eastAsia="Times New Roman" w:hAnsi="Arial" w:cs="Arial"/>
-                      <w:color w:val="000000"/>
-                      <w:kern w:val="0"/>
-                      <w:lang w:eastAsia="es-US"/>
-                      <w14:ligatures w14:val="none"/>
-                    </w:rPr>
-                    <w:lastRenderedPageBreak/>
-                    <w:t>Riesgo</w:t>
+                    <w:t>Nivel de Riesgo</w:t>
                   </w:r>
                 </w:p>
               </w:tc>
@@ -16331,7 +17537,6 @@
                       <w:lang w:eastAsia="es-US"/>
                       <w14:ligatures w14:val="none"/>
                     </w:rPr>
-                    <w:lastRenderedPageBreak/>
                     <w:t>Riesgo Global: Todos los riesgos identificados, al no ser gestionados formalmente, tienen una mayor probabilidad de materializarse</w:t>
                   </w:r>
                 </w:p>
@@ -16485,7 +17690,6 @@
               <w:rPr>
                 <w:rFonts w:ascii="Arial" w:hAnsi="Arial" w:cs="Arial"/>
               </w:rPr>
-              <w:lastRenderedPageBreak/>
               <w:t>RECOMENDACIONES</w:t>
             </w:r>
           </w:p>
@@ -16533,6 +17737,7 @@
               <w:rPr>
                 <w:rFonts w:ascii="Arial" w:hAnsi="Arial" w:cs="Arial"/>
               </w:rPr>
+              <w:lastRenderedPageBreak/>
               <w:t>Corto plazo (30-60 días): Asignar al futuro responsable de TI la tarea de facilitar e implementar un proceso de gestión de riesgos (alineado a ISO 27005). Este proceso debe establecer la metodología, las responsabilidades y la periodicidad de la revisión de riesgos.</w:t>
             </w:r>
           </w:p>
@@ -20272,7 +21477,7 @@
   <a:extraClrSchemeLst/>
   <a:extLst>
     <a:ext uri="{05A4C25C-085E-4340-85A3-A5531E510DB2}">
-      <thm15:themeFamily xmlns="" xmlns:thm15="http://schemas.microsoft.com/office/thememl/2012/main" name="Office Theme" id="{62F939B6-93AF-4DB8-9C6B-D6C7DFDC589F}" vid="{4A3C46E8-61CC-4603-A589-7422A47A8E4A}"/>
+      <thm15:themeFamily xmlns:thm15="http://schemas.microsoft.com/office/thememl/2012/main" xmlns="" name="Office Theme" id="{62F939B6-93AF-4DB8-9C6B-D6C7DFDC589F}" vid="{4A3C46E8-61CC-4603-A589-7422A47A8E4A}"/>
     </a:ext>
   </a:extLst>
 </a:theme>

</xml_diff>